<commit_message>
Split TMFC003's oversized Dependent API diagram into 3 pages
Its dependent-API list has 160 total operations -- far past a single readable
page. Split into TMFC003_Dependant_API_{1,2,3}.yaml (56 + 59 + 45 operations)
via the new bin-packing pagination in sync_diagram_yaml.py, never splitting a
single API's own operations across two pages. Rendered all three diagrams,
updated the main .md to embed them in sequence with "(N of 3)" captions, and
rebuilt the PDF/docx.

Co-Authored-By: Claude Sonnet 5 <noreply@anthropic.com>
</commit_message>
<xml_diff>
--- a/specifications/TMFC003-ProductOrderDeliveryOrchestrationAndManagement/Diagrams/TMFC003_Product_Order_Delivery_Orchestration_and_Management.docx
+++ b/specifications/TMFC003-ProductOrderDeliveryOrchestrationAndManagement/Diagrams/TMFC003_Product_Order_Delivery_Orchestration_and_Management.docx
@@ -8843,7 +8843,7 @@
       <w:r>
         <w:drawing>
           <wp:inline xmlns:a="http://schemas.openxmlformats.org/drawingml/2006/main" xmlns:pic="http://schemas.openxmlformats.org/drawingml/2006/picture">
-            <wp:extent cx="5394960" cy="14741665"/>
+            <wp:extent cx="5394960" cy="6383760"/>
             <wp:docPr id="3" name="Picture 3"/>
             <wp:cNvGraphicFramePr>
               <a:graphicFrameLocks noChangeAspect="1"/>
@@ -8852,7 +8852,7 @@
               <a:graphicData uri="http://schemas.openxmlformats.org/drawingml/2006/picture">
                 <pic:pic>
                   <pic:nvPicPr>
-                    <pic:cNvPr id="0" name="TMFC003_Dependant_API.png"/>
+                    <pic:cNvPr id="0" name="TMFC003_Dependant_API_1.png"/>
                     <pic:cNvPicPr/>
                   </pic:nvPicPr>
                   <pic:blipFill>
@@ -8864,7 +8864,79 @@
                   <pic:spPr>
                     <a:xfrm>
                       <a:off x="0" y="0"/>
-                      <a:ext cx="5394960" cy="14741665"/>
+                      <a:ext cx="5394960" cy="6383760"/>
+                    </a:xfrm>
+                    <a:prstGeom prst="rect"/>
+                  </pic:spPr>
+                </pic:pic>
+              </a:graphicData>
+            </a:graphic>
+          </wp:inline>
+        </w:drawing>
+      </w:r>
+    </w:p>
+    <w:p>
+      <w:r>
+        <w:drawing>
+          <wp:inline xmlns:a="http://schemas.openxmlformats.org/drawingml/2006/main" xmlns:pic="http://schemas.openxmlformats.org/drawingml/2006/picture">
+            <wp:extent cx="5394960" cy="5776458"/>
+            <wp:docPr id="4" name="Picture 4"/>
+            <wp:cNvGraphicFramePr>
+              <a:graphicFrameLocks noChangeAspect="1"/>
+            </wp:cNvGraphicFramePr>
+            <a:graphic>
+              <a:graphicData uri="http://schemas.openxmlformats.org/drawingml/2006/picture">
+                <pic:pic>
+                  <pic:nvPicPr>
+                    <pic:cNvPr id="0" name="TMFC003_Dependant_API_2.png"/>
+                    <pic:cNvPicPr/>
+                  </pic:nvPicPr>
+                  <pic:blipFill>
+                    <a:blip r:embed="rId50"/>
+                    <a:stretch>
+                      <a:fillRect/>
+                    </a:stretch>
+                  </pic:blipFill>
+                  <pic:spPr>
+                    <a:xfrm>
+                      <a:off x="0" y="0"/>
+                      <a:ext cx="5394960" cy="5776458"/>
+                    </a:xfrm>
+                    <a:prstGeom prst="rect"/>
+                  </pic:spPr>
+                </pic:pic>
+              </a:graphicData>
+            </a:graphic>
+          </wp:inline>
+        </w:drawing>
+      </w:r>
+    </w:p>
+    <w:p>
+      <w:r>
+        <w:drawing>
+          <wp:inline xmlns:a="http://schemas.openxmlformats.org/drawingml/2006/main" xmlns:pic="http://schemas.openxmlformats.org/drawingml/2006/picture">
+            <wp:extent cx="5394960" cy="4447993"/>
+            <wp:docPr id="5" name="Picture 5"/>
+            <wp:cNvGraphicFramePr>
+              <a:graphicFrameLocks noChangeAspect="1"/>
+            </wp:cNvGraphicFramePr>
+            <a:graphic>
+              <a:graphicData uri="http://schemas.openxmlformats.org/drawingml/2006/picture">
+                <pic:pic>
+                  <pic:nvPicPr>
+                    <pic:cNvPr id="0" name="TMFC003_Dependant_API_3.png"/>
+                    <pic:cNvPicPr/>
+                  </pic:nvPicPr>
+                  <pic:blipFill>
+                    <a:blip r:embed="rId51"/>
+                    <a:stretch>
+                      <a:fillRect/>
+                    </a:stretch>
+                  </pic:blipFill>
+                  <pic:spPr>
+                    <a:xfrm>
+                      <a:off x="0" y="0"/>
+                      <a:ext cx="5394960" cy="4447993"/>
                     </a:xfrm>
                     <a:prstGeom prst="rect"/>
                   </pic:spPr>
@@ -9232,7 +9304,7 @@
         <w:drawing>
           <wp:inline xmlns:a="http://schemas.openxmlformats.org/drawingml/2006/main" xmlns:pic="http://schemas.openxmlformats.org/drawingml/2006/picture">
             <wp:extent cx="5394960" cy="3896360"/>
-            <wp:docPr id="4" name="Picture 4"/>
+            <wp:docPr id="6" name="Picture 6"/>
             <wp:cNvGraphicFramePr>
               <a:graphicFrameLocks noChangeAspect="1"/>
             </wp:cNvGraphicFramePr>
@@ -9244,7 +9316,7 @@
                     <pic:cNvPicPr/>
                   </pic:nvPicPr>
                   <pic:blipFill>
-                    <a:blip r:embed="rId50"/>
+                    <a:blip r:embed="rId52"/>
                     <a:stretch>
                       <a:fillRect/>
                     </a:stretch>
@@ -10297,7 +10369,7 @@
         <w:drawing>
           <wp:inline xmlns:a="http://schemas.openxmlformats.org/drawingml/2006/main" xmlns:pic="http://schemas.openxmlformats.org/drawingml/2006/picture">
             <wp:extent cx="5394960" cy="8036289"/>
-            <wp:docPr id="5" name="Picture 5"/>
+            <wp:docPr id="7" name="Picture 7"/>
             <wp:cNvGraphicFramePr>
               <a:graphicFrameLocks noChangeAspect="1"/>
             </wp:cNvGraphicFramePr>
@@ -10309,7 +10381,7 @@
                     <pic:cNvPicPr/>
                   </pic:nvPicPr>
                   <pic:blipFill>
-                    <a:blip r:embed="rId51"/>
+                    <a:blip r:embed="rId53"/>
                     <a:stretch>
                       <a:fillRect/>
                     </a:stretch>

</xml_diff>

<commit_message>
Fix Events regeneration and regenerate TMFC003 documentation
sync_diagram_yaml.py: Events diagrams now regenerate fresh every run as a
direct passthrough of the main YAML's publishedEvents/subscribedEvents,
instead of matching against an old Diagrams file (which was confirmed
broken on TMFC003: dropped events, minted fake UNRESOLVED-<name> ids).
Also fixed API name resolution falling back to a stale UNRESOLVED-<id>
placeholder instead of the main YAML's own name field.

TMFC003: regenerated all diagrams (Exposed/Dependent API, Events, API
Context, eTOM-SID) and the main doc/PDF/docx, adding the previously
missing 6th SID ABE row and the eTOM-SID link diagram.

Co-Authored-By: Claude Sonnet 5 <noreply@anthropic.com>
</commit_message>
<xml_diff>
--- a/specifications/TMFC003-ProductOrderDeliveryOrchestrationAndManagement/Diagrams/TMFC003_Product_Order_Delivery_Orchestration_and_Management.docx
+++ b/specifications/TMFC003-ProductOrderDeliveryOrchestrationAndManagement/Diagrams/TMFC003_Product_Order_Delivery_Orchestration_and_Management.docx
@@ -788,6 +788,39 @@
           </w:p>
         </w:tc>
       </w:tr>
+      <w:tr>
+        <w:tc>
+          <w:tcPr>
+            <w:tcW w:type="dxa" w:w="2808"/>
+          </w:tcPr>
+          <w:p>
+            <w:r/>
+            <w:r>
+              <w:t>Customer Product Order</w:t>
+            </w:r>
+          </w:p>
+        </w:tc>
+        <w:tc>
+          <w:tcPr>
+            <w:tcW w:type="dxa" w:w="2995"/>
+          </w:tcPr>
+          <w:p>
+            <w:r/>
+            <w:r/>
+          </w:p>
+        </w:tc>
+        <w:tc>
+          <w:tcPr>
+            <w:tcW w:type="dxa" w:w="3557"/>
+          </w:tcPr>
+          <w:p>
+            <w:r/>
+            <w:r>
+              <w:t>Handles single customer orders and the various types thereof, such as regulated and non-regulated orders. / Orders ProductOfferings and concerns Products</w:t>
+            </w:r>
+          </w:p>
+        </w:tc>
+      </w:tr>
     </w:tbl>
     <w:p/>
     <w:p>
@@ -800,18 +833,38 @@
     </w:p>
     <w:p>
       <w:r>
-        <w:rPr>
-          <w:i/>
-        </w:rPr>
-        <w:t xml:space="preserve">no eTOM–SID links recorded for this component in </w:t>
-      </w:r>
-      <w:r>
-        <w:rPr>
-          <w:rFonts w:ascii="Consolas" w:hAnsi="Consolas"/>
-          <w:i/>
-          <w:sz w:val="18"/>
-        </w:rPr>
-        <w:t>TMFC003_eTOM_SID_Links.md</w:t>
+        <w:drawing>
+          <wp:inline xmlns:a="http://schemas.openxmlformats.org/drawingml/2006/main" xmlns:pic="http://schemas.openxmlformats.org/drawingml/2006/picture">
+            <wp:extent cx="5394960" cy="2361451"/>
+            <wp:docPr id="1" name="Picture 1"/>
+            <wp:cNvGraphicFramePr>
+              <a:graphicFrameLocks noChangeAspect="1"/>
+            </wp:cNvGraphicFramePr>
+            <a:graphic>
+              <a:graphicData uri="http://schemas.openxmlformats.org/drawingml/2006/picture">
+                <pic:pic>
+                  <pic:nvPicPr>
+                    <pic:cNvPr id="0" name="TMFC003_eTOM_SID.png"/>
+                    <pic:cNvPicPr/>
+                  </pic:nvPicPr>
+                  <pic:blipFill>
+                    <a:blip r:embed="rId47"/>
+                    <a:stretch>
+                      <a:fillRect/>
+                    </a:stretch>
+                  </pic:blipFill>
+                  <pic:spPr>
+                    <a:xfrm>
+                      <a:off x="0" y="0"/>
+                      <a:ext cx="5394960" cy="2361451"/>
+                    </a:xfrm>
+                    <a:prstGeom prst="rect"/>
+                  </pic:spPr>
+                </pic:pic>
+              </a:graphicData>
+            </a:graphic>
+          </wp:inline>
+        </w:drawing>
       </w:r>
     </w:p>
     <w:p>
@@ -3298,7 +3351,7 @@
         <w:drawing>
           <wp:inline xmlns:a="http://schemas.openxmlformats.org/drawingml/2006/main" xmlns:pic="http://schemas.openxmlformats.org/drawingml/2006/picture">
             <wp:extent cx="5394960" cy="6090904"/>
-            <wp:docPr id="1" name="Picture 1"/>
+            <wp:docPr id="2" name="Picture 2"/>
             <wp:cNvGraphicFramePr>
               <a:graphicFrameLocks noChangeAspect="1"/>
             </wp:cNvGraphicFramePr>
@@ -3310,7 +3363,7 @@
                     <pic:cNvPicPr/>
                   </pic:nvPicPr>
                   <pic:blipFill>
-                    <a:blip r:embed="rId47"/>
+                    <a:blip r:embed="rId48"/>
                     <a:stretch>
                       <a:fillRect/>
                     </a:stretch>
@@ -4316,7 +4369,7 @@
         <w:drawing>
           <wp:inline xmlns:a="http://schemas.openxmlformats.org/drawingml/2006/main" xmlns:pic="http://schemas.openxmlformats.org/drawingml/2006/picture">
             <wp:extent cx="5394960" cy="4398354"/>
-            <wp:docPr id="2" name="Picture 2"/>
+            <wp:docPr id="3" name="Picture 3"/>
             <wp:cNvGraphicFramePr>
               <a:graphicFrameLocks noChangeAspect="1"/>
             </wp:cNvGraphicFramePr>
@@ -4328,7 +4381,7 @@
                     <pic:cNvPicPr/>
                   </pic:nvPicPr>
                   <pic:blipFill>
-                    <a:blip r:embed="rId48"/>
+                    <a:blip r:embed="rId49"/>
                     <a:stretch>
                       <a:fillRect/>
                     </a:stretch>
@@ -8844,7 +8897,7 @@
         <w:drawing>
           <wp:inline xmlns:a="http://schemas.openxmlformats.org/drawingml/2006/main" xmlns:pic="http://schemas.openxmlformats.org/drawingml/2006/picture">
             <wp:extent cx="5394960" cy="6383760"/>
-            <wp:docPr id="3" name="Picture 3"/>
+            <wp:docPr id="4" name="Picture 4"/>
             <wp:cNvGraphicFramePr>
               <a:graphicFrameLocks noChangeAspect="1"/>
             </wp:cNvGraphicFramePr>
@@ -8856,7 +8909,7 @@
                     <pic:cNvPicPr/>
                   </pic:nvPicPr>
                   <pic:blipFill>
-                    <a:blip r:embed="rId49"/>
+                    <a:blip r:embed="rId50"/>
                     <a:stretch>
                       <a:fillRect/>
                     </a:stretch>
@@ -8880,7 +8933,7 @@
         <w:drawing>
           <wp:inline xmlns:a="http://schemas.openxmlformats.org/drawingml/2006/main" xmlns:pic="http://schemas.openxmlformats.org/drawingml/2006/picture">
             <wp:extent cx="5394960" cy="5776458"/>
-            <wp:docPr id="4" name="Picture 4"/>
+            <wp:docPr id="5" name="Picture 5"/>
             <wp:cNvGraphicFramePr>
               <a:graphicFrameLocks noChangeAspect="1"/>
             </wp:cNvGraphicFramePr>
@@ -8892,7 +8945,7 @@
                     <pic:cNvPicPr/>
                   </pic:nvPicPr>
                   <pic:blipFill>
-                    <a:blip r:embed="rId50"/>
+                    <a:blip r:embed="rId51"/>
                     <a:stretch>
                       <a:fillRect/>
                     </a:stretch>
@@ -8916,7 +8969,7 @@
         <w:drawing>
           <wp:inline xmlns:a="http://schemas.openxmlformats.org/drawingml/2006/main" xmlns:pic="http://schemas.openxmlformats.org/drawingml/2006/picture">
             <wp:extent cx="5394960" cy="4447993"/>
-            <wp:docPr id="5" name="Picture 5"/>
+            <wp:docPr id="6" name="Picture 6"/>
             <wp:cNvGraphicFramePr>
               <a:graphicFrameLocks noChangeAspect="1"/>
             </wp:cNvGraphicFramePr>
@@ -8928,7 +8981,7 @@
                     <pic:cNvPicPr/>
                   </pic:nvPicPr>
                   <pic:blipFill>
-                    <a:blip r:embed="rId51"/>
+                    <a:blip r:embed="rId52"/>
                     <a:stretch>
                       <a:fillRect/>
                     </a:stretch>
@@ -8994,7 +9047,7 @@
         </w:trPr>
         <w:tc>
           <w:tcPr>
-            <w:tcW w:type="dxa" w:w="1310"/>
+            <w:tcW w:type="dxa" w:w="1404"/>
           </w:tcPr>
           <w:p>
             <w:r/>
@@ -9008,7 +9061,7 @@
         </w:tc>
         <w:tc>
           <w:tcPr>
-            <w:tcW w:type="dxa" w:w="3650"/>
+            <w:tcW w:type="dxa" w:w="2995"/>
           </w:tcPr>
           <w:p>
             <w:r/>
@@ -9022,7 +9075,7 @@
         </w:tc>
         <w:tc>
           <w:tcPr>
-            <w:tcW w:type="dxa" w:w="4399"/>
+            <w:tcW w:type="dxa" w:w="4961"/>
           </w:tcPr>
           <w:p>
             <w:r/>
@@ -9038,32 +9091,60 @@
       <w:tr>
         <w:tc>
           <w:tcPr>
-            <w:tcW w:type="dxa" w:w="1310"/>
-          </w:tcPr>
-          <w:p>
-            <w:r/>
-            <w:r>
-              <w:t>TMF622</w:t>
-            </w:r>
-          </w:p>
-        </w:tc>
-        <w:tc>
-          <w:tcPr>
-            <w:tcW w:type="dxa" w:w="3650"/>
-          </w:tcPr>
-          <w:p>
-            <w:r/>
-            <w:r>
-              <w:t>Product Ordering Management API</w:t>
-            </w:r>
-          </w:p>
-        </w:tc>
-        <w:tc>
-          <w:tcPr>
-            <w:tcW w:type="dxa" w:w="4399"/>
-          </w:tcPr>
-          <w:p>
-            <w:r/>
+            <w:tcW w:type="dxa" w:w="1404"/>
+          </w:tcPr>
+          <w:p>
+            <w:r/>
+            <w:r/>
+          </w:p>
+        </w:tc>
+        <w:tc>
+          <w:tcPr>
+            <w:tcW w:type="dxa" w:w="2995"/>
+          </w:tcPr>
+          <w:p>
+            <w:r/>
+            <w:r>
+              <w:t>ProductOrder</w:t>
+            </w:r>
+          </w:p>
+        </w:tc>
+        <w:tc>
+          <w:tcPr>
+            <w:tcW w:type="dxa" w:w="4961"/>
+          </w:tcPr>
+          <w:p>
+            <w:r/>
+            <w:r>
+              <w:t>productOrderStateChangeEvent</w:t>
+            </w:r>
+            <w:r>
+              <w:br/>
+            </w:r>
+            <w:r>
+              <w:t>productOrderCreateEvent</w:t>
+            </w:r>
+            <w:r>
+              <w:br/>
+            </w:r>
+            <w:r>
+              <w:t>productOrderAttributeValueChangeEvent</w:t>
+            </w:r>
+            <w:r>
+              <w:br/>
+            </w:r>
+            <w:r>
+              <w:t>productOrderDeleteEvent</w:t>
+            </w:r>
+            <w:r>
+              <w:br/>
+            </w:r>
+            <w:r>
+              <w:t>productOrderInformationRequiredEvent</w:t>
+            </w:r>
+            <w:r>
+              <w:br/>
+            </w:r>
             <w:r>
               <w:t>cancelProductOrderCreateEvent</w:t>
             </w:r>
@@ -9071,43 +9152,13 @@
               <w:br/>
             </w:r>
             <w:r>
+              <w:t>cancelProductOrderStateChangeEvent</w:t>
+            </w:r>
+            <w:r>
+              <w:br/>
+            </w:r>
+            <w:r>
               <w:t>cancelProductOrderInformationRequiredEvent</w:t>
-            </w:r>
-            <w:r>
-              <w:br/>
-            </w:r>
-            <w:r>
-              <w:t>cancelProductOrderStateChangeEvent</w:t>
-            </w:r>
-            <w:r>
-              <w:br/>
-            </w:r>
-            <w:r>
-              <w:t>productOrderAttributeValueChangeEvent</w:t>
-            </w:r>
-            <w:r>
-              <w:br/>
-            </w:r>
-            <w:r>
-              <w:t>productOrderCreateEvent</w:t>
-            </w:r>
-            <w:r>
-              <w:br/>
-            </w:r>
-            <w:r>
-              <w:t>productOrderDeleteEvent</w:t>
-            </w:r>
-            <w:r>
-              <w:br/>
-            </w:r>
-            <w:r>
-              <w:t>productOrderInformationRequiredEvent</w:t>
-            </w:r>
-            <w:r>
-              <w:br/>
-            </w:r>
-            <w:r>
-              <w:t>productOrderStateChangeEvent</w:t>
             </w:r>
           </w:p>
         </w:tc>
@@ -9115,32 +9166,129 @@
       <w:tr>
         <w:tc>
           <w:tcPr>
-            <w:tcW w:type="dxa" w:w="1310"/>
-          </w:tcPr>
-          <w:p>
-            <w:r/>
-            <w:r>
-              <w:t>TMF701</w:t>
-            </w:r>
-          </w:p>
-        </w:tc>
-        <w:tc>
-          <w:tcPr>
-            <w:tcW w:type="dxa" w:w="3650"/>
-          </w:tcPr>
-          <w:p>
-            <w:r/>
-            <w:r>
-              <w:t>Process Management API</w:t>
-            </w:r>
-          </w:p>
-        </w:tc>
-        <w:tc>
-          <w:tcPr>
-            <w:tcW w:type="dxa" w:w="4399"/>
-          </w:tcPr>
-          <w:p>
-            <w:r/>
+            <w:tcW w:type="dxa" w:w="1404"/>
+          </w:tcPr>
+          <w:p>
+            <w:r/>
+            <w:r/>
+          </w:p>
+        </w:tc>
+        <w:tc>
+          <w:tcPr>
+            <w:tcW w:type="dxa" w:w="2995"/>
+          </w:tcPr>
+          <w:p>
+            <w:r/>
+            <w:r>
+              <w:t>ProcessFlowManagement</w:t>
+            </w:r>
+          </w:p>
+        </w:tc>
+        <w:tc>
+          <w:tcPr>
+            <w:tcW w:type="dxa" w:w="4961"/>
+          </w:tcPr>
+          <w:p>
+            <w:r/>
+            <w:r>
+              <w:t>processFlowCreateEvent</w:t>
+            </w:r>
+            <w:r>
+              <w:br/>
+            </w:r>
+            <w:r>
+              <w:t>processFlowStateChangeEvent</w:t>
+            </w:r>
+            <w:r>
+              <w:br/>
+            </w:r>
+            <w:r>
+              <w:t>processFlowDeleteEvent</w:t>
+            </w:r>
+            <w:r>
+              <w:br/>
+            </w:r>
+            <w:r>
+              <w:t>processFlowAttributeValueChangeEvent</w:t>
+            </w:r>
+            <w:r>
+              <w:br/>
+            </w:r>
+            <w:r>
+              <w:t>taskFlowCreateEvent</w:t>
+            </w:r>
+            <w:r>
+              <w:br/>
+            </w:r>
+            <w:r>
+              <w:t>taskFlowStateChangeEvent</w:t>
+            </w:r>
+            <w:r>
+              <w:br/>
+            </w:r>
+            <w:r>
+              <w:t>taskFlowDeleteEvent</w:t>
+            </w:r>
+            <w:r>
+              <w:br/>
+            </w:r>
+            <w:r>
+              <w:t>taskFlowAttributeValueChangeEvent</w:t>
+            </w:r>
+            <w:r>
+              <w:br/>
+            </w:r>
+            <w:r>
+              <w:t>taskFlowInformationRequiredEvent</w:t>
+            </w:r>
+          </w:p>
+        </w:tc>
+      </w:tr>
+      <w:tr>
+        <w:tc>
+          <w:tcPr>
+            <w:tcW w:type="dxa" w:w="1404"/>
+          </w:tcPr>
+          <w:p>
+            <w:r/>
+            <w:r/>
+          </w:p>
+        </w:tc>
+        <w:tc>
+          <w:tcPr>
+            <w:tcW w:type="dxa" w:w="2995"/>
+          </w:tcPr>
+          <w:p>
+            <w:r/>
+            <w:r>
+              <w:t>ProcessManagement</w:t>
+            </w:r>
+          </w:p>
+        </w:tc>
+        <w:tc>
+          <w:tcPr>
+            <w:tcW w:type="dxa" w:w="4961"/>
+          </w:tcPr>
+          <w:p>
+            <w:r/>
+            <w:r>
+              <w:t>processCreateEvent</w:t>
+            </w:r>
+            <w:r>
+              <w:br/>
+            </w:r>
+            <w:r>
+              <w:t>processStateChangeEvent</w:t>
+            </w:r>
+            <w:r>
+              <w:br/>
+            </w:r>
+            <w:r>
+              <w:t>processDeleteEvent</w:t>
+            </w:r>
+            <w:r>
+              <w:br/>
+            </w:r>
             <w:r>
               <w:t>processAttributeValueChangeEvent</w:t>
             </w:r>
@@ -9148,37 +9296,31 @@
               <w:br/>
             </w:r>
             <w:r>
-              <w:t>processCreateEvent</w:t>
-            </w:r>
-            <w:r>
-              <w:br/>
-            </w:r>
-            <w:r>
-              <w:t>processDeleteEvent</w:t>
-            </w:r>
-            <w:r>
-              <w:br/>
-            </w:r>
-            <w:r>
-              <w:t>processFlowAttributeValueChangeEvent</w:t>
-            </w:r>
-            <w:r>
-              <w:br/>
-            </w:r>
-            <w:r>
-              <w:t>processFlowCreateEvent</w:t>
-            </w:r>
-            <w:r>
-              <w:br/>
-            </w:r>
-            <w:r>
-              <w:t>processFlowDeleteEvent</w:t>
-            </w:r>
-            <w:r>
-              <w:br/>
-            </w:r>
-            <w:r>
-              <w:t>processFlowStateChangeEvent</w:t>
+              <w:t>taskCreateEvent</w:t>
+            </w:r>
+            <w:r>
+              <w:br/>
+            </w:r>
+            <w:r>
+              <w:t>taskStateChangeEvent</w:t>
+            </w:r>
+            <w:r>
+              <w:br/>
+            </w:r>
+            <w:r>
+              <w:t>taskDeleteEvent</w:t>
+            </w:r>
+            <w:r>
+              <w:br/>
+            </w:r>
+            <w:r>
+              <w:t>taskAttributeValueChangeEvent</w:t>
+            </w:r>
+            <w:r>
+              <w:br/>
+            </w:r>
+            <w:r>
+              <w:t>taskInformationRequiredEvent</w:t>
             </w:r>
             <w:r>
               <w:br/>
@@ -9208,66 +9350,6 @@
               <w:br/>
             </w:r>
             <w:r>
-              <w:t>processStateChangeEvent</w:t>
-            </w:r>
-            <w:r>
-              <w:br/>
-            </w:r>
-            <w:r>
-              <w:t>taskAttributeValueChangeEvent</w:t>
-            </w:r>
-            <w:r>
-              <w:br/>
-            </w:r>
-            <w:r>
-              <w:t>taskCreateEvent</w:t>
-            </w:r>
-            <w:r>
-              <w:br/>
-            </w:r>
-            <w:r>
-              <w:t>taskDeleteEvent</w:t>
-            </w:r>
-            <w:r>
-              <w:br/>
-            </w:r>
-            <w:r>
-              <w:t>taskFlowAttributeValueChangeEvent</w:t>
-            </w:r>
-            <w:r>
-              <w:br/>
-            </w:r>
-            <w:r>
-              <w:t>taskFlowCreateEvent</w:t>
-            </w:r>
-            <w:r>
-              <w:br/>
-            </w:r>
-            <w:r>
-              <w:t>taskFlowDeleteEvent</w:t>
-            </w:r>
-            <w:r>
-              <w:br/>
-            </w:r>
-            <w:r>
-              <w:t>taskFlowInformationRequiredEvent</w:t>
-            </w:r>
-            <w:r>
-              <w:br/>
-            </w:r>
-            <w:r>
-              <w:t>taskFlowStateChangeEvent</w:t>
-            </w:r>
-            <w:r>
-              <w:br/>
-            </w:r>
-            <w:r>
-              <w:t>taskInformationRequiredEvent</w:t>
-            </w:r>
-            <w:r>
-              <w:br/>
-            </w:r>
-            <w:r>
               <w:t>taskSpecificationAttributeValueChangeEvent</w:t>
             </w:r>
             <w:r>
@@ -9287,12 +9369,6 @@
             </w:r>
             <w:r>
               <w:t>taskSpecificationStateChangeEvent</w:t>
-            </w:r>
-            <w:r>
-              <w:br/>
-            </w:r>
-            <w:r>
-              <w:t>taskStateChangeEvent</w:t>
             </w:r>
           </w:p>
         </w:tc>
@@ -9303,8 +9379,8 @@
       <w:r>
         <w:drawing>
           <wp:inline xmlns:a="http://schemas.openxmlformats.org/drawingml/2006/main" xmlns:pic="http://schemas.openxmlformats.org/drawingml/2006/picture">
-            <wp:extent cx="5394960" cy="3896360"/>
-            <wp:docPr id="6" name="Picture 6"/>
+            <wp:extent cx="5394960" cy="4273632"/>
+            <wp:docPr id="7" name="Picture 7"/>
             <wp:cNvGraphicFramePr>
               <a:graphicFrameLocks noChangeAspect="1"/>
             </wp:cNvGraphicFramePr>
@@ -9316,7 +9392,7 @@
                     <pic:cNvPicPr/>
                   </pic:nvPicPr>
                   <pic:blipFill>
-                    <a:blip r:embed="rId52"/>
+                    <a:blip r:embed="rId53"/>
                     <a:stretch>
                       <a:fillRect/>
                     </a:stretch>
@@ -9324,7 +9400,7 @@
                   <pic:spPr>
                     <a:xfrm>
                       <a:off x="0" y="0"/>
-                      <a:ext cx="5394960" cy="3896360"/>
+                      <a:ext cx="5394960" cy="4273632"/>
                     </a:xfrm>
                     <a:prstGeom prst="rect"/>
                   </pic:spPr>
@@ -9369,7 +9445,7 @@
         </w:trPr>
         <w:tc>
           <w:tcPr>
-            <w:tcW w:type="dxa" w:w="1217"/>
+            <w:tcW w:type="dxa" w:w="1310"/>
           </w:tcPr>
           <w:p>
             <w:r/>
@@ -9383,7 +9459,7 @@
         </w:tc>
         <w:tc>
           <w:tcPr>
-            <w:tcW w:type="dxa" w:w="4025"/>
+            <w:tcW w:type="dxa" w:w="3463"/>
           </w:tcPr>
           <w:p>
             <w:r/>
@@ -9397,7 +9473,7 @@
         </w:tc>
         <w:tc>
           <w:tcPr>
-            <w:tcW w:type="dxa" w:w="4118"/>
+            <w:tcW w:type="dxa" w:w="4586"/>
           </w:tcPr>
           <w:p>
             <w:r/>
@@ -9413,46 +9489,74 @@
       <w:tr>
         <w:tc>
           <w:tcPr>
-            <w:tcW w:type="dxa" w:w="1217"/>
-          </w:tcPr>
-          <w:p>
-            <w:r/>
-            <w:r>
-              <w:t>TMF620</w:t>
-            </w:r>
-          </w:p>
-        </w:tc>
-        <w:tc>
-          <w:tcPr>
-            <w:tcW w:type="dxa" w:w="4025"/>
-          </w:tcPr>
-          <w:p>
-            <w:r/>
-            <w:r>
-              <w:t>Product Catalog Management API</w:t>
-            </w:r>
-          </w:p>
-        </w:tc>
-        <w:tc>
-          <w:tcPr>
-            <w:tcW w:type="dxa" w:w="4118"/>
-          </w:tcPr>
-          <w:p>
-            <w:r/>
-            <w:r>
-              <w:t>productOfferingDeleteEvent</w:t>
-            </w:r>
-            <w:r>
-              <w:br/>
-            </w:r>
-            <w:r>
-              <w:t>productOfferingPriceDeleteEvent</w:t>
-            </w:r>
-            <w:r>
-              <w:br/>
-            </w:r>
-            <w:r>
-              <w:t>productSpecificationDeleteEvent</w:t>
+            <w:tcW w:type="dxa" w:w="1310"/>
+          </w:tcPr>
+          <w:p>
+            <w:r/>
+            <w:r/>
+          </w:p>
+        </w:tc>
+        <w:tc>
+          <w:tcPr>
+            <w:tcW w:type="dxa" w:w="3463"/>
+          </w:tcPr>
+          <w:p>
+            <w:r/>
+            <w:r>
+              <w:t>ServiceOrder</w:t>
+            </w:r>
+          </w:p>
+        </w:tc>
+        <w:tc>
+          <w:tcPr>
+            <w:tcW w:type="dxa" w:w="4586"/>
+          </w:tcPr>
+          <w:p>
+            <w:r/>
+            <w:r>
+              <w:t>serviceOrderAttributeValueChangeEvent</w:t>
+            </w:r>
+            <w:r>
+              <w:br/>
+            </w:r>
+            <w:r>
+              <w:t>serviceOrderInformationRequiredEvent</w:t>
+            </w:r>
+            <w:r>
+              <w:br/>
+            </w:r>
+            <w:r>
+              <w:t>serviceOrderMilestoneEvent</w:t>
+            </w:r>
+            <w:r>
+              <w:br/>
+            </w:r>
+            <w:r>
+              <w:t>serviceOrderJeopardyEvent</w:t>
+            </w:r>
+            <w:r>
+              <w:br/>
+            </w:r>
+            <w:r>
+              <w:t>serviceOrderDeleteEvent</w:t>
+            </w:r>
+            <w:r>
+              <w:br/>
+            </w:r>
+            <w:r>
+              <w:t>cancelServiceOrderStateChangeEvent</w:t>
+            </w:r>
+            <w:r>
+              <w:br/>
+            </w:r>
+            <w:r>
+              <w:t>cancelServiceOrderInformationRequiredEvent</w:t>
+            </w:r>
+            <w:r>
+              <w:br/>
+            </w:r>
+            <w:r>
+              <w:t>serviceOrderStateChangeEvent</w:t>
             </w:r>
           </w:p>
         </w:tc>
@@ -9460,40 +9564,56 @@
       <w:tr>
         <w:tc>
           <w:tcPr>
-            <w:tcW w:type="dxa" w:w="1217"/>
-          </w:tcPr>
-          <w:p>
-            <w:r/>
-            <w:r>
-              <w:t>TMF632</w:t>
-            </w:r>
-          </w:p>
-        </w:tc>
-        <w:tc>
-          <w:tcPr>
-            <w:tcW w:type="dxa" w:w="4025"/>
-          </w:tcPr>
-          <w:p>
-            <w:r/>
-            <w:r>
-              <w:t>Party Management API</w:t>
-            </w:r>
-          </w:p>
-        </w:tc>
-        <w:tc>
-          <w:tcPr>
-            <w:tcW w:type="dxa" w:w="4118"/>
-          </w:tcPr>
-          <w:p>
-            <w:r/>
-            <w:r>
-              <w:t>individualDeleteEvent</w:t>
-            </w:r>
-            <w:r>
-              <w:br/>
-            </w:r>
-            <w:r>
-              <w:t>organizationDeleteEvent</w:t>
+            <w:tcW w:type="dxa" w:w="1310"/>
+          </w:tcPr>
+          <w:p>
+            <w:r/>
+            <w:r/>
+          </w:p>
+        </w:tc>
+        <w:tc>
+          <w:tcPr>
+            <w:tcW w:type="dxa" w:w="3463"/>
+          </w:tcPr>
+          <w:p>
+            <w:r/>
+            <w:r>
+              <w:t>ResourceOrder</w:t>
+            </w:r>
+          </w:p>
+        </w:tc>
+        <w:tc>
+          <w:tcPr>
+            <w:tcW w:type="dxa" w:w="4586"/>
+          </w:tcPr>
+          <w:p>
+            <w:r/>
+            <w:r>
+              <w:t>resourceOrderStateChange</w:t>
+            </w:r>
+            <w:r>
+              <w:br/>
+            </w:r>
+            <w:r>
+              <w:t>resourceOrderAttributeValueChangeEvent</w:t>
+            </w:r>
+            <w:r>
+              <w:br/>
+            </w:r>
+            <w:r>
+              <w:t>resourceOrderInformationRequiredEvent</w:t>
+            </w:r>
+            <w:r>
+              <w:br/>
+            </w:r>
+            <w:r>
+              <w:t>cancelResourceOrderStateChange</w:t>
+            </w:r>
+            <w:r>
+              <w:br/>
+            </w:r>
+            <w:r>
+              <w:t>cancelResourceOrderInformationRequiredEvent</w:t>
             </w:r>
           </w:p>
         </w:tc>
@@ -9501,34 +9621,44 @@
       <w:tr>
         <w:tc>
           <w:tcPr>
-            <w:tcW w:type="dxa" w:w="1217"/>
-          </w:tcPr>
-          <w:p>
-            <w:r/>
-            <w:r>
-              <w:t>TMF633</w:t>
-            </w:r>
-          </w:p>
-        </w:tc>
-        <w:tc>
-          <w:tcPr>
-            <w:tcW w:type="dxa" w:w="4025"/>
-          </w:tcPr>
-          <w:p>
-            <w:r/>
-            <w:r>
-              <w:t>Service Catalog Management API</w:t>
-            </w:r>
-          </w:p>
-        </w:tc>
-        <w:tc>
-          <w:tcPr>
-            <w:tcW w:type="dxa" w:w="4118"/>
-          </w:tcPr>
-          <w:p>
-            <w:r/>
-            <w:r>
-              <w:t>serviceSpecificationDeleteEvent</w:t>
+            <w:tcW w:type="dxa" w:w="1310"/>
+          </w:tcPr>
+          <w:p>
+            <w:r/>
+            <w:r/>
+          </w:p>
+        </w:tc>
+        <w:tc>
+          <w:tcPr>
+            <w:tcW w:type="dxa" w:w="3463"/>
+          </w:tcPr>
+          <w:p>
+            <w:r/>
+            <w:r>
+              <w:t>GeographicLocation</w:t>
+            </w:r>
+          </w:p>
+        </w:tc>
+        <w:tc>
+          <w:tcPr>
+            <w:tcW w:type="dxa" w:w="4586"/>
+          </w:tcPr>
+          <w:p>
+            <w:r/>
+            <w:r>
+              <w:t>geographicLocationCreateEvent</w:t>
+            </w:r>
+            <w:r>
+              <w:br/>
+            </w:r>
+            <w:r>
+              <w:t>geographicLocationAttributeValueChangeEvent</w:t>
+            </w:r>
+            <w:r>
+              <w:br/>
+            </w:r>
+            <w:r>
+              <w:t>geographicLocationDeleteEvent</w:t>
             </w:r>
           </w:p>
         </w:tc>
@@ -9536,34 +9666,56 @@
       <w:tr>
         <w:tc>
           <w:tcPr>
-            <w:tcW w:type="dxa" w:w="1217"/>
-          </w:tcPr>
-          <w:p>
-            <w:r/>
-            <w:r>
-              <w:t>TMF634</w:t>
-            </w:r>
-          </w:p>
-        </w:tc>
-        <w:tc>
-          <w:tcPr>
-            <w:tcW w:type="dxa" w:w="4025"/>
-          </w:tcPr>
-          <w:p>
-            <w:r/>
-            <w:r>
-              <w:t>Resource Catalog Management API</w:t>
-            </w:r>
-          </w:p>
-        </w:tc>
-        <w:tc>
-          <w:tcPr>
-            <w:tcW w:type="dxa" w:w="4118"/>
-          </w:tcPr>
-          <w:p>
-            <w:r/>
-            <w:r>
-              <w:t>resourceSpecificationDeleteEvent</w:t>
+            <w:tcW w:type="dxa" w:w="1310"/>
+          </w:tcPr>
+          <w:p>
+            <w:r/>
+            <w:r/>
+          </w:p>
+        </w:tc>
+        <w:tc>
+          <w:tcPr>
+            <w:tcW w:type="dxa" w:w="3463"/>
+          </w:tcPr>
+          <w:p>
+            <w:r/>
+            <w:r>
+              <w:t>GeographicSiteManagement</w:t>
+            </w:r>
+          </w:p>
+        </w:tc>
+        <w:tc>
+          <w:tcPr>
+            <w:tcW w:type="dxa" w:w="4586"/>
+          </w:tcPr>
+          <w:p>
+            <w:r/>
+            <w:r>
+              <w:t>geographicSiteCreateEvent</w:t>
+            </w:r>
+            <w:r>
+              <w:br/>
+            </w:r>
+            <w:r>
+              <w:t>geographicSiteAttributeValueChangeEvent</w:t>
+            </w:r>
+            <w:r>
+              <w:br/>
+            </w:r>
+            <w:r>
+              <w:t>geographicSiteDeleteEvent</w:t>
+            </w:r>
+            <w:r>
+              <w:br/>
+            </w:r>
+            <w:r>
+              <w:t>geographicSiteStatusChangeEvent</w:t>
+            </w:r>
+            <w:r>
+              <w:br/>
+            </w:r>
+            <w:r>
+              <w:t>geographicSiteStateChangeEvent</w:t>
             </w:r>
           </w:p>
         </w:tc>
@@ -9571,58 +9723,50 @@
       <w:tr>
         <w:tc>
           <w:tcPr>
-            <w:tcW w:type="dxa" w:w="1217"/>
-          </w:tcPr>
-          <w:p>
-            <w:r/>
-            <w:r>
-              <w:t>TMF637</w:t>
-            </w:r>
-          </w:p>
-        </w:tc>
-        <w:tc>
-          <w:tcPr>
-            <w:tcW w:type="dxa" w:w="4025"/>
-          </w:tcPr>
-          <w:p>
-            <w:r/>
-            <w:r>
-              <w:t>Product Inventory Management API</w:t>
-            </w:r>
-          </w:p>
-        </w:tc>
-        <w:tc>
-          <w:tcPr>
-            <w:tcW w:type="dxa" w:w="4118"/>
-          </w:tcPr>
-          <w:p>
-            <w:r/>
-            <w:r>
-              <w:t>productAttributeValueChangeEvent</w:t>
-            </w:r>
-            <w:r>
-              <w:br/>
-            </w:r>
-            <w:r>
-              <w:t>productBatchEvent</w:t>
-            </w:r>
-            <w:r>
-              <w:br/>
-            </w:r>
-            <w:r>
-              <w:t>productCreateEvent</w:t>
-            </w:r>
-            <w:r>
-              <w:br/>
-            </w:r>
-            <w:r>
-              <w:t>productDeleteEvent</w:t>
-            </w:r>
-            <w:r>
-              <w:br/>
-            </w:r>
-            <w:r>
-              <w:t>productStateChangeEvent</w:t>
+            <w:tcW w:type="dxa" w:w="1310"/>
+          </w:tcPr>
+          <w:p>
+            <w:r/>
+            <w:r/>
+          </w:p>
+        </w:tc>
+        <w:tc>
+          <w:tcPr>
+            <w:tcW w:type="dxa" w:w="3463"/>
+          </w:tcPr>
+          <w:p>
+            <w:r/>
+            <w:r>
+              <w:t>GeographicAddressManagement</w:t>
+            </w:r>
+          </w:p>
+        </w:tc>
+        <w:tc>
+          <w:tcPr>
+            <w:tcW w:type="dxa" w:w="4586"/>
+          </w:tcPr>
+          <w:p>
+            <w:r/>
+            <w:r>
+              <w:t>geographicAddressValidationStateChangeEvent</w:t>
+            </w:r>
+            <w:r>
+              <w:br/>
+            </w:r>
+            <w:r>
+              <w:t>geographicAddressAttributeValueChangeEvent</w:t>
+            </w:r>
+            <w:r>
+              <w:br/>
+            </w:r>
+            <w:r>
+              <w:t>geographicAddressCreateEvent</w:t>
+            </w:r>
+            <w:r>
+              <w:br/>
+            </w:r>
+            <w:r>
+              <w:t>geographicAddressDeleteEvent</w:t>
             </w:r>
           </w:p>
         </w:tc>
@@ -9630,34 +9774,50 @@
       <w:tr>
         <w:tc>
           <w:tcPr>
-            <w:tcW w:type="dxa" w:w="1217"/>
-          </w:tcPr>
-          <w:p>
-            <w:r/>
-            <w:r>
-              <w:t>TMF638</w:t>
-            </w:r>
-          </w:p>
-        </w:tc>
-        <w:tc>
-          <w:tcPr>
-            <w:tcW w:type="dxa" w:w="4025"/>
-          </w:tcPr>
-          <w:p>
-            <w:r/>
-            <w:r>
-              <w:t>Service Inventory Management API</w:t>
-            </w:r>
-          </w:p>
-        </w:tc>
-        <w:tc>
-          <w:tcPr>
-            <w:tcW w:type="dxa" w:w="4118"/>
-          </w:tcPr>
-          <w:p>
-            <w:r/>
-            <w:r>
-              <w:t>serviceDeleteEvent</w:t>
+            <w:tcW w:type="dxa" w:w="1310"/>
+          </w:tcPr>
+          <w:p>
+            <w:r/>
+            <w:r/>
+          </w:p>
+        </w:tc>
+        <w:tc>
+          <w:tcPr>
+            <w:tcW w:type="dxa" w:w="3463"/>
+          </w:tcPr>
+          <w:p>
+            <w:r/>
+            <w:r>
+              <w:t>IntentManagement</w:t>
+            </w:r>
+          </w:p>
+        </w:tc>
+        <w:tc>
+          <w:tcPr>
+            <w:tcW w:type="dxa" w:w="4586"/>
+          </w:tcPr>
+          <w:p>
+            <w:r/>
+            <w:r>
+              <w:t>intentCreateEvent</w:t>
+            </w:r>
+            <w:r>
+              <w:br/>
+            </w:r>
+            <w:r>
+              <w:t>intentStatusChangeEvent</w:t>
+            </w:r>
+            <w:r>
+              <w:br/>
+            </w:r>
+            <w:r>
+              <w:t>intentDeleteEvent</w:t>
+            </w:r>
+            <w:r>
+              <w:br/>
+            </w:r>
+            <w:r>
+              <w:t>intentAttributeValueChangeEvent</w:t>
             </w:r>
           </w:p>
         </w:tc>
@@ -9665,34 +9825,50 @@
       <w:tr>
         <w:tc>
           <w:tcPr>
-            <w:tcW w:type="dxa" w:w="1217"/>
-          </w:tcPr>
-          <w:p>
-            <w:r/>
-            <w:r>
-              <w:t>TMF639</w:t>
-            </w:r>
-          </w:p>
-        </w:tc>
-        <w:tc>
-          <w:tcPr>
-            <w:tcW w:type="dxa" w:w="4025"/>
-          </w:tcPr>
-          <w:p>
-            <w:r/>
-            <w:r>
-              <w:t>Resource Inventory Management API</w:t>
-            </w:r>
-          </w:p>
-        </w:tc>
-        <w:tc>
-          <w:tcPr>
-            <w:tcW w:type="dxa" w:w="4118"/>
-          </w:tcPr>
-          <w:p>
-            <w:r/>
-            <w:r>
-              <w:t>resourceDeleteEvent</w:t>
+            <w:tcW w:type="dxa" w:w="1310"/>
+          </w:tcPr>
+          <w:p>
+            <w:r/>
+            <w:r/>
+          </w:p>
+        </w:tc>
+        <w:tc>
+          <w:tcPr>
+            <w:tcW w:type="dxa" w:w="3463"/>
+          </w:tcPr>
+          <w:p>
+            <w:r/>
+            <w:r>
+              <w:t>AppointmentManagement</w:t>
+            </w:r>
+          </w:p>
+        </w:tc>
+        <w:tc>
+          <w:tcPr>
+            <w:tcW w:type="dxa" w:w="4586"/>
+          </w:tcPr>
+          <w:p>
+            <w:r/>
+            <w:r>
+              <w:t>appointmentStateChange</w:t>
+            </w:r>
+            <w:r>
+              <w:br/>
+            </w:r>
+            <w:r>
+              <w:t>appointmentCreateEvent</w:t>
+            </w:r>
+            <w:r>
+              <w:br/>
+            </w:r>
+            <w:r>
+              <w:t>appointmentAttributeValueChangeEvent</w:t>
+            </w:r>
+            <w:r>
+              <w:br/>
+            </w:r>
+            <w:r>
+              <w:t>appointmentDeleteEvent</w:t>
             </w:r>
           </w:p>
         </w:tc>
@@ -9700,76 +9876,80 @@
       <w:tr>
         <w:tc>
           <w:tcPr>
-            <w:tcW w:type="dxa" w:w="1217"/>
-          </w:tcPr>
-          <w:p>
-            <w:r/>
-            <w:r>
-              <w:t>TMF641</w:t>
-            </w:r>
-          </w:p>
-        </w:tc>
-        <w:tc>
-          <w:tcPr>
-            <w:tcW w:type="dxa" w:w="4025"/>
-          </w:tcPr>
-          <w:p>
-            <w:r/>
-            <w:r>
-              <w:t>Service Ordering Management API</w:t>
-            </w:r>
-          </w:p>
-        </w:tc>
-        <w:tc>
-          <w:tcPr>
-            <w:tcW w:type="dxa" w:w="4118"/>
-          </w:tcPr>
-          <w:p>
-            <w:r/>
-            <w:r>
-              <w:t>cancelServiceOrderInformationRequiredEvent</w:t>
-            </w:r>
-            <w:r>
-              <w:br/>
-            </w:r>
-            <w:r>
-              <w:t>cancelServiceOrderStateChangeEvent</w:t>
-            </w:r>
-            <w:r>
-              <w:br/>
-            </w:r>
-            <w:r>
-              <w:t>serviceOrderAttributeValueChangeEvent</w:t>
-            </w:r>
-            <w:r>
-              <w:br/>
-            </w:r>
-            <w:r>
-              <w:t>serviceOrderDeleteEvent</w:t>
-            </w:r>
-            <w:r>
-              <w:br/>
-            </w:r>
-            <w:r>
-              <w:t>serviceOrderInformationRequiredEvent</w:t>
-            </w:r>
-            <w:r>
-              <w:br/>
-            </w:r>
-            <w:r>
-              <w:t>serviceOrderJeopardyEvent</w:t>
-            </w:r>
-            <w:r>
-              <w:br/>
-            </w:r>
-            <w:r>
-              <w:t>serviceOrderMilestoneEvent</w:t>
-            </w:r>
-            <w:r>
-              <w:br/>
-            </w:r>
-            <w:r>
-              <w:t>serviceOrderStateChangeEvent</w:t>
+            <w:tcW w:type="dxa" w:w="1310"/>
+          </w:tcPr>
+          <w:p>
+            <w:r/>
+            <w:r/>
+          </w:p>
+        </w:tc>
+        <w:tc>
+          <w:tcPr>
+            <w:tcW w:type="dxa" w:w="3463"/>
+          </w:tcPr>
+          <w:p>
+            <w:r/>
+            <w:r>
+              <w:t>ProductOfferingQualification</w:t>
+            </w:r>
+          </w:p>
+        </w:tc>
+        <w:tc>
+          <w:tcPr>
+            <w:tcW w:type="dxa" w:w="4586"/>
+          </w:tcPr>
+          <w:p>
+            <w:r/>
+            <w:r>
+              <w:t>productOfferingQualificationCreateEvent</w:t>
+            </w:r>
+            <w:r>
+              <w:br/>
+            </w:r>
+            <w:r>
+              <w:t>productOfferingQualificationAttributeValueChangeEvent</w:t>
+            </w:r>
+            <w:r>
+              <w:br/>
+            </w:r>
+            <w:r>
+              <w:t>productOfferingQualificationStateChangeEvent</w:t>
+            </w:r>
+            <w:r>
+              <w:br/>
+            </w:r>
+            <w:r>
+              <w:t>productOfferingQualificationDeleteEvent</w:t>
+            </w:r>
+            <w:r>
+              <w:br/>
+            </w:r>
+            <w:r>
+              <w:t>productOfferingQualificationInformationRequiredEvent</w:t>
+            </w:r>
+            <w:r>
+              <w:br/>
+            </w:r>
+            <w:r>
+              <w:t>checkProductOfferingQualificationCreateEvent</w:t>
+            </w:r>
+            <w:r>
+              <w:br/>
+            </w:r>
+            <w:r>
+              <w:t>checkProductOfferingQualificationAttributeValueChangeEvent</w:t>
+            </w:r>
+            <w:r>
+              <w:br/>
+            </w:r>
+            <w:r>
+              <w:t>checkProductOfferingQualificationStateChangeEvent</w:t>
+            </w:r>
+            <w:r>
+              <w:br/>
+            </w:r>
+            <w:r>
+              <w:t>checkProductOfferingQualificationDeleteEvent</w:t>
             </w:r>
           </w:p>
         </w:tc>
@@ -9777,52 +9957,38 @@
       <w:tr>
         <w:tc>
           <w:tcPr>
-            <w:tcW w:type="dxa" w:w="1217"/>
-          </w:tcPr>
-          <w:p>
-            <w:r/>
-            <w:r>
-              <w:t>TMF646</w:t>
-            </w:r>
-          </w:p>
-        </w:tc>
-        <w:tc>
-          <w:tcPr>
-            <w:tcW w:type="dxa" w:w="4025"/>
-          </w:tcPr>
-          <w:p>
-            <w:r/>
-            <w:r>
-              <w:t>Appointment Management API</w:t>
-            </w:r>
-          </w:p>
-        </w:tc>
-        <w:tc>
-          <w:tcPr>
-            <w:tcW w:type="dxa" w:w="4118"/>
-          </w:tcPr>
-          <w:p>
-            <w:r/>
-            <w:r>
-              <w:t>appointmentAttributeValueChangeEvent</w:t>
-            </w:r>
-            <w:r>
-              <w:br/>
-            </w:r>
-            <w:r>
-              <w:t>appointmentCreateEvent</w:t>
-            </w:r>
-            <w:r>
-              <w:br/>
-            </w:r>
-            <w:r>
-              <w:t>appointmentDeleteEvent</w:t>
-            </w:r>
-            <w:r>
-              <w:br/>
-            </w:r>
-            <w:r>
-              <w:t>appointmentStateChange</w:t>
+            <w:tcW w:type="dxa" w:w="1310"/>
+          </w:tcPr>
+          <w:p>
+            <w:r/>
+            <w:r/>
+          </w:p>
+        </w:tc>
+        <w:tc>
+          <w:tcPr>
+            <w:tcW w:type="dxa" w:w="3463"/>
+          </w:tcPr>
+          <w:p>
+            <w:r/>
+            <w:r>
+              <w:t>PartyManagement</w:t>
+            </w:r>
+          </w:p>
+        </w:tc>
+        <w:tc>
+          <w:tcPr>
+            <w:tcW w:type="dxa" w:w="4586"/>
+          </w:tcPr>
+          <w:p>
+            <w:r/>
+            <w:r>
+              <w:t>individualDeleteEvent</w:t>
+            </w:r>
+            <w:r>
+              <w:br/>
+            </w:r>
+            <w:r>
+              <w:t>organizationDeleteEvent</w:t>
             </w:r>
           </w:p>
         </w:tc>
@@ -9830,34 +9996,38 @@
       <w:tr>
         <w:tc>
           <w:tcPr>
-            <w:tcW w:type="dxa" w:w="1217"/>
-          </w:tcPr>
-          <w:p>
-            <w:r/>
-            <w:r>
-              <w:t>TMF648</w:t>
-            </w:r>
-          </w:p>
-        </w:tc>
-        <w:tc>
-          <w:tcPr>
-            <w:tcW w:type="dxa" w:w="4025"/>
-          </w:tcPr>
-          <w:p>
-            <w:r/>
-            <w:r>
-              <w:t>Quote Management API</w:t>
-            </w:r>
-          </w:p>
-        </w:tc>
-        <w:tc>
-          <w:tcPr>
-            <w:tcW w:type="dxa" w:w="4118"/>
-          </w:tcPr>
-          <w:p>
-            <w:r/>
-            <w:r>
-              <w:t>quoteDeleteEvent</w:t>
+            <w:tcW w:type="dxa" w:w="1310"/>
+          </w:tcPr>
+          <w:p>
+            <w:r/>
+            <w:r/>
+          </w:p>
+        </w:tc>
+        <w:tc>
+          <w:tcPr>
+            <w:tcW w:type="dxa" w:w="3463"/>
+          </w:tcPr>
+          <w:p>
+            <w:r/>
+            <w:r>
+              <w:t>PartyRoleManagement</w:t>
+            </w:r>
+          </w:p>
+        </w:tc>
+        <w:tc>
+          <w:tcPr>
+            <w:tcW w:type="dxa" w:w="4586"/>
+          </w:tcPr>
+          <w:p>
+            <w:r/>
+            <w:r>
+              <w:t>partyRoleDeleteEvent</w:t>
+            </w:r>
+            <w:r>
+              <w:br/>
+            </w:r>
+            <w:r>
+              <w:t>partyRoleSpecificationDeleteEvent</w:t>
             </w:r>
           </w:p>
         </w:tc>
@@ -9865,34 +10035,32 @@
       <w:tr>
         <w:tc>
           <w:tcPr>
-            <w:tcW w:type="dxa" w:w="1217"/>
-          </w:tcPr>
-          <w:p>
-            <w:r/>
-            <w:r>
-              <w:t>TMF651</w:t>
-            </w:r>
-          </w:p>
-        </w:tc>
-        <w:tc>
-          <w:tcPr>
-            <w:tcW w:type="dxa" w:w="4025"/>
-          </w:tcPr>
-          <w:p>
-            <w:r/>
-            <w:r>
-              <w:t>Agreement Management API</w:t>
-            </w:r>
-          </w:p>
-        </w:tc>
-        <w:tc>
-          <w:tcPr>
-            <w:tcW w:type="dxa" w:w="4118"/>
-          </w:tcPr>
-          <w:p>
-            <w:r/>
-            <w:r>
-              <w:t>agreementDeleteEvent</w:t>
+            <w:tcW w:type="dxa" w:w="1310"/>
+          </w:tcPr>
+          <w:p>
+            <w:r/>
+            <w:r/>
+          </w:p>
+        </w:tc>
+        <w:tc>
+          <w:tcPr>
+            <w:tcW w:type="dxa" w:w="3463"/>
+          </w:tcPr>
+          <w:p>
+            <w:r/>
+            <w:r>
+              <w:t>PaymentManagement</w:t>
+            </w:r>
+          </w:p>
+        </w:tc>
+        <w:tc>
+          <w:tcPr>
+            <w:tcW w:type="dxa" w:w="4586"/>
+          </w:tcPr>
+          <w:p>
+            <w:r/>
+            <w:r>
+              <w:t>paymentDeleteEvent</w:t>
             </w:r>
           </w:p>
         </w:tc>
@@ -9900,58 +10068,32 @@
       <w:tr>
         <w:tc>
           <w:tcPr>
-            <w:tcW w:type="dxa" w:w="1217"/>
-          </w:tcPr>
-          <w:p>
-            <w:r/>
-            <w:r>
-              <w:t>TMF652</w:t>
-            </w:r>
-          </w:p>
-        </w:tc>
-        <w:tc>
-          <w:tcPr>
-            <w:tcW w:type="dxa" w:w="4025"/>
-          </w:tcPr>
-          <w:p>
-            <w:r/>
-            <w:r>
-              <w:t>Resource Order Management API</w:t>
-            </w:r>
-          </w:p>
-        </w:tc>
-        <w:tc>
-          <w:tcPr>
-            <w:tcW w:type="dxa" w:w="4118"/>
-          </w:tcPr>
-          <w:p>
-            <w:r/>
-            <w:r>
-              <w:t>cancelResourceOrderInformationRequiredEvent</w:t>
-            </w:r>
-            <w:r>
-              <w:br/>
-            </w:r>
-            <w:r>
-              <w:t>cancelResourceOrderStateChange</w:t>
-            </w:r>
-            <w:r>
-              <w:br/>
-            </w:r>
-            <w:r>
-              <w:t>resourceOrderAttributeValueChangeEvent</w:t>
-            </w:r>
-            <w:r>
-              <w:br/>
-            </w:r>
-            <w:r>
-              <w:t>resourceOrderInformationRequiredEvent</w:t>
-            </w:r>
-            <w:r>
-              <w:br/>
-            </w:r>
-            <w:r>
-              <w:t>resourceOrderStateChange</w:t>
+            <w:tcW w:type="dxa" w:w="1310"/>
+          </w:tcPr>
+          <w:p>
+            <w:r/>
+            <w:r/>
+          </w:p>
+        </w:tc>
+        <w:tc>
+          <w:tcPr>
+            <w:tcW w:type="dxa" w:w="3463"/>
+          </w:tcPr>
+          <w:p>
+            <w:r/>
+            <w:r>
+              <w:t>AccountManagement</w:t>
+            </w:r>
+          </w:p>
+        </w:tc>
+        <w:tc>
+          <w:tcPr>
+            <w:tcW w:type="dxa" w:w="4586"/>
+          </w:tcPr>
+          <w:p>
+            <w:r/>
+            <w:r>
+              <w:t>billingAccountDeleteEvent</w:t>
             </w:r>
           </w:p>
         </w:tc>
@@ -9959,34 +10101,32 @@
       <w:tr>
         <w:tc>
           <w:tcPr>
-            <w:tcW w:type="dxa" w:w="1217"/>
-          </w:tcPr>
-          <w:p>
-            <w:r/>
-            <w:r>
-              <w:t>TMF666</w:t>
-            </w:r>
-          </w:p>
-        </w:tc>
-        <w:tc>
-          <w:tcPr>
-            <w:tcW w:type="dxa" w:w="4025"/>
-          </w:tcPr>
-          <w:p>
-            <w:r/>
-            <w:r>
-              <w:t>Account Management API</w:t>
-            </w:r>
-          </w:p>
-        </w:tc>
-        <w:tc>
-          <w:tcPr>
-            <w:tcW w:type="dxa" w:w="4118"/>
-          </w:tcPr>
-          <w:p>
-            <w:r/>
-            <w:r>
-              <w:t>billingAccountDeleteEvent</w:t>
+            <w:tcW w:type="dxa" w:w="1310"/>
+          </w:tcPr>
+          <w:p>
+            <w:r/>
+            <w:r/>
+          </w:p>
+        </w:tc>
+        <w:tc>
+          <w:tcPr>
+            <w:tcW w:type="dxa" w:w="3463"/>
+          </w:tcPr>
+          <w:p>
+            <w:r/>
+            <w:r>
+              <w:t>AgreementManagement</w:t>
+            </w:r>
+          </w:p>
+        </w:tc>
+        <w:tc>
+          <w:tcPr>
+            <w:tcW w:type="dxa" w:w="4586"/>
+          </w:tcPr>
+          <w:p>
+            <w:r/>
+            <w:r>
+              <w:t>agreementDeleteEvent</w:t>
             </w:r>
           </w:p>
         </w:tc>
@@ -9994,40 +10134,32 @@
       <w:tr>
         <w:tc>
           <w:tcPr>
-            <w:tcW w:type="dxa" w:w="1217"/>
-          </w:tcPr>
-          <w:p>
-            <w:r/>
-            <w:r>
-              <w:t>TMF669</w:t>
-            </w:r>
-          </w:p>
-        </w:tc>
-        <w:tc>
-          <w:tcPr>
-            <w:tcW w:type="dxa" w:w="4025"/>
-          </w:tcPr>
-          <w:p>
-            <w:r/>
-            <w:r>
-              <w:t>Party Role Management API</w:t>
-            </w:r>
-          </w:p>
-        </w:tc>
-        <w:tc>
-          <w:tcPr>
-            <w:tcW w:type="dxa" w:w="4118"/>
-          </w:tcPr>
-          <w:p>
-            <w:r/>
-            <w:r>
-              <w:t>partyRoleDeleteEvent</w:t>
-            </w:r>
-            <w:r>
-              <w:br/>
-            </w:r>
-            <w:r>
-              <w:t>partyRoleSpecificationDeleteEvent</w:t>
+            <w:tcW w:type="dxa" w:w="1310"/>
+          </w:tcPr>
+          <w:p>
+            <w:r/>
+            <w:r/>
+          </w:p>
+        </w:tc>
+        <w:tc>
+          <w:tcPr>
+            <w:tcW w:type="dxa" w:w="3463"/>
+          </w:tcPr>
+          <w:p>
+            <w:r/>
+            <w:r>
+              <w:t>ResourceInventoryManagement</w:t>
+            </w:r>
+          </w:p>
+        </w:tc>
+        <w:tc>
+          <w:tcPr>
+            <w:tcW w:type="dxa" w:w="4586"/>
+          </w:tcPr>
+          <w:p>
+            <w:r/>
+            <w:r>
+              <w:t>resourceDeleteEvent</w:t>
             </w:r>
           </w:p>
         </w:tc>
@@ -10035,52 +10167,32 @@
       <w:tr>
         <w:tc>
           <w:tcPr>
-            <w:tcW w:type="dxa" w:w="1217"/>
-          </w:tcPr>
-          <w:p>
-            <w:r/>
-            <w:r>
-              <w:t>TMF673</w:t>
-            </w:r>
-          </w:p>
-        </w:tc>
-        <w:tc>
-          <w:tcPr>
-            <w:tcW w:type="dxa" w:w="4025"/>
-          </w:tcPr>
-          <w:p>
-            <w:r/>
-            <w:r>
-              <w:t>Geographic Address Management API</w:t>
-            </w:r>
-          </w:p>
-        </w:tc>
-        <w:tc>
-          <w:tcPr>
-            <w:tcW w:type="dxa" w:w="4118"/>
-          </w:tcPr>
-          <w:p>
-            <w:r/>
-            <w:r>
-              <w:t>geographicAddressAttributeValueChangeEvent</w:t>
-            </w:r>
-            <w:r>
-              <w:br/>
-            </w:r>
-            <w:r>
-              <w:t>geographicAddressCreateEvent</w:t>
-            </w:r>
-            <w:r>
-              <w:br/>
-            </w:r>
-            <w:r>
-              <w:t>geographicAddressDeleteEvent</w:t>
-            </w:r>
-            <w:r>
-              <w:br/>
-            </w:r>
-            <w:r>
-              <w:t>geographicAddressValidationStateChangeEvent</w:t>
+            <w:tcW w:type="dxa" w:w="1310"/>
+          </w:tcPr>
+          <w:p>
+            <w:r/>
+            <w:r/>
+          </w:p>
+        </w:tc>
+        <w:tc>
+          <w:tcPr>
+            <w:tcW w:type="dxa" w:w="3463"/>
+          </w:tcPr>
+          <w:p>
+            <w:r/>
+            <w:r>
+              <w:t>ResourceCatalogManagement</w:t>
+            </w:r>
+          </w:p>
+        </w:tc>
+        <w:tc>
+          <w:tcPr>
+            <w:tcW w:type="dxa" w:w="4586"/>
+          </w:tcPr>
+          <w:p>
+            <w:r/>
+            <w:r>
+              <w:t>resourceSpecificationDeleteEvent</w:t>
             </w:r>
           </w:p>
         </w:tc>
@@ -10088,58 +10200,32 @@
       <w:tr>
         <w:tc>
           <w:tcPr>
-            <w:tcW w:type="dxa" w:w="1217"/>
-          </w:tcPr>
-          <w:p>
-            <w:r/>
-            <w:r>
-              <w:t>TMF674</w:t>
-            </w:r>
-          </w:p>
-        </w:tc>
-        <w:tc>
-          <w:tcPr>
-            <w:tcW w:type="dxa" w:w="4025"/>
-          </w:tcPr>
-          <w:p>
-            <w:r/>
-            <w:r>
-              <w:t>Geographic Site Management API</w:t>
-            </w:r>
-          </w:p>
-        </w:tc>
-        <w:tc>
-          <w:tcPr>
-            <w:tcW w:type="dxa" w:w="4118"/>
-          </w:tcPr>
-          <w:p>
-            <w:r/>
-            <w:r>
-              <w:t>geographicSiteAttributeValueChangeEvent</w:t>
-            </w:r>
-            <w:r>
-              <w:br/>
-            </w:r>
-            <w:r>
-              <w:t>geographicSiteCreateEvent</w:t>
-            </w:r>
-            <w:r>
-              <w:br/>
-            </w:r>
-            <w:r>
-              <w:t>geographicSiteDeleteEvent</w:t>
-            </w:r>
-            <w:r>
-              <w:br/>
-            </w:r>
-            <w:r>
-              <w:t>geographicSiteStateChangeEvent</w:t>
-            </w:r>
-            <w:r>
-              <w:br/>
-            </w:r>
-            <w:r>
-              <w:t>geographicSiteStatusChangeEvent</w:t>
+            <w:tcW w:type="dxa" w:w="1310"/>
+          </w:tcPr>
+          <w:p>
+            <w:r/>
+            <w:r/>
+          </w:p>
+        </w:tc>
+        <w:tc>
+          <w:tcPr>
+            <w:tcW w:type="dxa" w:w="3463"/>
+          </w:tcPr>
+          <w:p>
+            <w:r/>
+            <w:r>
+              <w:t>ServiceInventoryManagement</w:t>
+            </w:r>
+          </w:p>
+        </w:tc>
+        <w:tc>
+          <w:tcPr>
+            <w:tcW w:type="dxa" w:w="4586"/>
+          </w:tcPr>
+          <w:p>
+            <w:r/>
+            <w:r>
+              <w:t>serviceDeleteEvent</w:t>
             </w:r>
           </w:p>
         </w:tc>
@@ -10147,46 +10233,32 @@
       <w:tr>
         <w:tc>
           <w:tcPr>
-            <w:tcW w:type="dxa" w:w="1217"/>
-          </w:tcPr>
-          <w:p>
-            <w:r/>
-            <w:r>
-              <w:t>TMF675</w:t>
-            </w:r>
-          </w:p>
-        </w:tc>
-        <w:tc>
-          <w:tcPr>
-            <w:tcW w:type="dxa" w:w="4025"/>
-          </w:tcPr>
-          <w:p>
-            <w:r/>
-            <w:r>
-              <w:t>Geographic Location Management API</w:t>
-            </w:r>
-          </w:p>
-        </w:tc>
-        <w:tc>
-          <w:tcPr>
-            <w:tcW w:type="dxa" w:w="4118"/>
-          </w:tcPr>
-          <w:p>
-            <w:r/>
-            <w:r>
-              <w:t>geographicLocationAttributeValueChangeEvent</w:t>
-            </w:r>
-            <w:r>
-              <w:br/>
-            </w:r>
-            <w:r>
-              <w:t>geographicLocationCreateEvent</w:t>
-            </w:r>
-            <w:r>
-              <w:br/>
-            </w:r>
-            <w:r>
-              <w:t>geographicLocationDeleteEvent</w:t>
+            <w:tcW w:type="dxa" w:w="1310"/>
+          </w:tcPr>
+          <w:p>
+            <w:r/>
+            <w:r/>
+          </w:p>
+        </w:tc>
+        <w:tc>
+          <w:tcPr>
+            <w:tcW w:type="dxa" w:w="3463"/>
+          </w:tcPr>
+          <w:p>
+            <w:r/>
+            <w:r>
+              <w:t>ServiceCatalogManagement</w:t>
+            </w:r>
+          </w:p>
+        </w:tc>
+        <w:tc>
+          <w:tcPr>
+            <w:tcW w:type="dxa" w:w="4586"/>
+          </w:tcPr>
+          <w:p>
+            <w:r/>
+            <w:r>
+              <w:t>serviceSpecificationDeleteEvent</w:t>
             </w:r>
           </w:p>
         </w:tc>
@@ -10194,34 +10266,56 @@
       <w:tr>
         <w:tc>
           <w:tcPr>
-            <w:tcW w:type="dxa" w:w="1217"/>
-          </w:tcPr>
-          <w:p>
-            <w:r/>
-            <w:r>
-              <w:t>TMF676</w:t>
-            </w:r>
-          </w:p>
-        </w:tc>
-        <w:tc>
-          <w:tcPr>
-            <w:tcW w:type="dxa" w:w="4025"/>
-          </w:tcPr>
-          <w:p>
-            <w:r/>
-            <w:r>
-              <w:t>Payment Management API</w:t>
-            </w:r>
-          </w:p>
-        </w:tc>
-        <w:tc>
-          <w:tcPr>
-            <w:tcW w:type="dxa" w:w="4118"/>
-          </w:tcPr>
-          <w:p>
-            <w:r/>
-            <w:r>
-              <w:t>paymentDeleteEvent</w:t>
+            <w:tcW w:type="dxa" w:w="1310"/>
+          </w:tcPr>
+          <w:p>
+            <w:r/>
+            <w:r/>
+          </w:p>
+        </w:tc>
+        <w:tc>
+          <w:tcPr>
+            <w:tcW w:type="dxa" w:w="3463"/>
+          </w:tcPr>
+          <w:p>
+            <w:r/>
+            <w:r>
+              <w:t>ProductInventoryManagement</w:t>
+            </w:r>
+          </w:p>
+        </w:tc>
+        <w:tc>
+          <w:tcPr>
+            <w:tcW w:type="dxa" w:w="4586"/>
+          </w:tcPr>
+          <w:p>
+            <w:r/>
+            <w:r>
+              <w:t>productCreateEvent</w:t>
+            </w:r>
+            <w:r>
+              <w:br/>
+            </w:r>
+            <w:r>
+              <w:t>productAttributeValueChangeEvent</w:t>
+            </w:r>
+            <w:r>
+              <w:br/>
+            </w:r>
+            <w:r>
+              <w:t>productStateChangeEvent</w:t>
+            </w:r>
+            <w:r>
+              <w:br/>
+            </w:r>
+            <w:r>
+              <w:t>productDeleteEvent</w:t>
+            </w:r>
+            <w:r>
+              <w:br/>
+            </w:r>
+            <w:r>
+              <w:t>productBatchEvent</w:t>
             </w:r>
           </w:p>
         </w:tc>
@@ -10229,82 +10323,44 @@
       <w:tr>
         <w:tc>
           <w:tcPr>
-            <w:tcW w:type="dxa" w:w="1217"/>
-          </w:tcPr>
-          <w:p>
-            <w:r/>
-            <w:r>
-              <w:t>TMF679</w:t>
-            </w:r>
-          </w:p>
-        </w:tc>
-        <w:tc>
-          <w:tcPr>
-            <w:tcW w:type="dxa" w:w="4025"/>
-          </w:tcPr>
-          <w:p>
-            <w:r/>
-            <w:r>
-              <w:t>Product Offering Qualification Management API</w:t>
-            </w:r>
-          </w:p>
-        </w:tc>
-        <w:tc>
-          <w:tcPr>
-            <w:tcW w:type="dxa" w:w="4118"/>
-          </w:tcPr>
-          <w:p>
-            <w:r/>
-            <w:r>
-              <w:t>checkProductOfferingQualificationAttributeValueChangeEvent</w:t>
-            </w:r>
-            <w:r>
-              <w:br/>
-            </w:r>
-            <w:r>
-              <w:t>checkProductOfferingQualificationCreateEvent</w:t>
-            </w:r>
-            <w:r>
-              <w:br/>
-            </w:r>
-            <w:r>
-              <w:t>checkProductOfferingQualificationDeleteEvent</w:t>
-            </w:r>
-            <w:r>
-              <w:br/>
-            </w:r>
-            <w:r>
-              <w:t>checkProductOfferingQualificationStateChangeEvent</w:t>
-            </w:r>
-            <w:r>
-              <w:br/>
-            </w:r>
-            <w:r>
-              <w:t>productOfferingQualificationAttributeValueChangeEvent</w:t>
-            </w:r>
-            <w:r>
-              <w:br/>
-            </w:r>
-            <w:r>
-              <w:t>productOfferingQualificationCreateEvent</w:t>
-            </w:r>
-            <w:r>
-              <w:br/>
-            </w:r>
-            <w:r>
-              <w:t>productOfferingQualificationDeleteEvent</w:t>
-            </w:r>
-            <w:r>
-              <w:br/>
-            </w:r>
-            <w:r>
-              <w:t>productOfferingQualificationInformationRequiredEvent</w:t>
-            </w:r>
-            <w:r>
-              <w:br/>
-            </w:r>
-            <w:r>
-              <w:t>productOfferingQualificationStateChangeEvent</w:t>
+            <w:tcW w:type="dxa" w:w="1310"/>
+          </w:tcPr>
+          <w:p>
+            <w:r/>
+            <w:r/>
+          </w:p>
+        </w:tc>
+        <w:tc>
+          <w:tcPr>
+            <w:tcW w:type="dxa" w:w="3463"/>
+          </w:tcPr>
+          <w:p>
+            <w:r/>
+            <w:r>
+              <w:t>ProductCatalogManagement</w:t>
+            </w:r>
+          </w:p>
+        </w:tc>
+        <w:tc>
+          <w:tcPr>
+            <w:tcW w:type="dxa" w:w="4586"/>
+          </w:tcPr>
+          <w:p>
+            <w:r/>
+            <w:r>
+              <w:t>productSpecificationDeleteEvent</w:t>
+            </w:r>
+            <w:r>
+              <w:br/>
+            </w:r>
+            <w:r>
+              <w:t>productOfferingDeleteEvent</w:t>
+            </w:r>
+            <w:r>
+              <w:br/>
+            </w:r>
+            <w:r>
+              <w:t>productOfferingPriceDeleteEvent</w:t>
             </w:r>
           </w:p>
         </w:tc>
@@ -10312,52 +10368,32 @@
       <w:tr>
         <w:tc>
           <w:tcPr>
-            <w:tcW w:type="dxa" w:w="1217"/>
-          </w:tcPr>
-          <w:p>
-            <w:r/>
-            <w:r>
-              <w:t>TMF921</w:t>
-            </w:r>
-          </w:p>
-        </w:tc>
-        <w:tc>
-          <w:tcPr>
-            <w:tcW w:type="dxa" w:w="4025"/>
-          </w:tcPr>
-          <w:p>
-            <w:r/>
-            <w:r>
-              <w:t>Intent Management API</w:t>
-            </w:r>
-          </w:p>
-        </w:tc>
-        <w:tc>
-          <w:tcPr>
-            <w:tcW w:type="dxa" w:w="4118"/>
-          </w:tcPr>
-          <w:p>
-            <w:r/>
-            <w:r>
-              <w:t>intentAttributeValueChangeEvent</w:t>
-            </w:r>
-            <w:r>
-              <w:br/>
-            </w:r>
-            <w:r>
-              <w:t>intentCreateEvent</w:t>
-            </w:r>
-            <w:r>
-              <w:br/>
-            </w:r>
-            <w:r>
-              <w:t>intentDeleteEvent</w:t>
-            </w:r>
-            <w:r>
-              <w:br/>
-            </w:r>
-            <w:r>
-              <w:t>intentStatusChangeEvent</w:t>
+            <w:tcW w:type="dxa" w:w="1310"/>
+          </w:tcPr>
+          <w:p>
+            <w:r/>
+            <w:r/>
+          </w:p>
+        </w:tc>
+        <w:tc>
+          <w:tcPr>
+            <w:tcW w:type="dxa" w:w="3463"/>
+          </w:tcPr>
+          <w:p>
+            <w:r/>
+            <w:r>
+              <w:t>QuoteManagement</w:t>
+            </w:r>
+          </w:p>
+        </w:tc>
+        <w:tc>
+          <w:tcPr>
+            <w:tcW w:type="dxa" w:w="4586"/>
+          </w:tcPr>
+          <w:p>
+            <w:r/>
+            <w:r>
+              <w:t>quoteDeleteEvent</w:t>
             </w:r>
           </w:p>
         </w:tc>
@@ -10368,8 +10404,8 @@
       <w:r>
         <w:drawing>
           <wp:inline xmlns:a="http://schemas.openxmlformats.org/drawingml/2006/main" xmlns:pic="http://schemas.openxmlformats.org/drawingml/2006/picture">
-            <wp:extent cx="5394960" cy="8036289"/>
-            <wp:docPr id="7" name="Picture 7"/>
+            <wp:extent cx="5394960" cy="7603997"/>
+            <wp:docPr id="8" name="Picture 8"/>
             <wp:cNvGraphicFramePr>
               <a:graphicFrameLocks noChangeAspect="1"/>
             </wp:cNvGraphicFramePr>
@@ -10377,11 +10413,11 @@
               <a:graphicData uri="http://schemas.openxmlformats.org/drawingml/2006/picture">
                 <pic:pic>
                   <pic:nvPicPr>
-                    <pic:cNvPr id="0" name="TMFC003_Subscribed_Events.png"/>
+                    <pic:cNvPr id="0" name="TMFC003_Subscribed_Events_1.png"/>
                     <pic:cNvPicPr/>
                   </pic:nvPicPr>
                   <pic:blipFill>
-                    <a:blip r:embed="rId53"/>
+                    <a:blip r:embed="rId54"/>
                     <a:stretch>
                       <a:fillRect/>
                     </a:stretch>
@@ -10389,7 +10425,43 @@
                   <pic:spPr>
                     <a:xfrm>
                       <a:off x="0" y="0"/>
-                      <a:ext cx="5394960" cy="8036289"/>
+                      <a:ext cx="5394960" cy="7603997"/>
+                    </a:xfrm>
+                    <a:prstGeom prst="rect"/>
+                  </pic:spPr>
+                </pic:pic>
+              </a:graphicData>
+            </a:graphic>
+          </wp:inline>
+        </w:drawing>
+      </w:r>
+    </w:p>
+    <w:p>
+      <w:r>
+        <w:drawing>
+          <wp:inline xmlns:a="http://schemas.openxmlformats.org/drawingml/2006/main" xmlns:pic="http://schemas.openxmlformats.org/drawingml/2006/picture">
+            <wp:extent cx="5394960" cy="747570"/>
+            <wp:docPr id="9" name="Picture 9"/>
+            <wp:cNvGraphicFramePr>
+              <a:graphicFrameLocks noChangeAspect="1"/>
+            </wp:cNvGraphicFramePr>
+            <a:graphic>
+              <a:graphicData uri="http://schemas.openxmlformats.org/drawingml/2006/picture">
+                <pic:pic>
+                  <pic:nvPicPr>
+                    <pic:cNvPr id="0" name="TMFC003_Subscribed_Events_2.png"/>
+                    <pic:cNvPicPr/>
+                  </pic:nvPicPr>
+                  <pic:blipFill>
+                    <a:blip r:embed="rId55"/>
+                    <a:stretch>
+                      <a:fillRect/>
+                    </a:stretch>
+                  </pic:blipFill>
+                  <pic:spPr>
+                    <a:xfrm>
+                      <a:off x="0" y="0"/>
+                      <a:ext cx="5394960" cy="747570"/>
                     </a:xfrm>
                     <a:prstGeom prst="rect"/>
                   </pic:spPr>

</xml_diff>

<commit_message>
Fix Events regeneration bug; regenerate TMFC003 documentation (#21)
* ho humm

* Fix Events regeneration and regenerate TMFC003 documentation

sync_diagram_yaml.py: Events diagrams now regenerate fresh every run as a
direct passthrough of the main YAML's publishedEvents/subscribedEvents,
instead of matching against an old Diagrams file (which was confirmed
broken on TMFC003: dropped events, minted fake UNRESOLVED-<name> ids).
Also fixed API name resolution falling back to a stale UNRESOLVED-<id>
placeholder instead of the main YAML's own name field.

TMFC003: regenerated all diagrams (Exposed/Dependent API, Events, API
Context, eTOM-SID) and the main doc/PDF/docx, adding the previously
missing 6th SID ABE row and the eTOM-SID link diagram.

Co-Authored-By: Claude Sonnet 5 <noreply@anthropic.com>

---------

Co-authored-by: Claude Sonnet 5 <noreply@anthropic.com>
</commit_message>
<xml_diff>
--- a/specifications/TMFC003-ProductOrderDeliveryOrchestrationAndManagement/Diagrams/TMFC003_Product_Order_Delivery_Orchestration_and_Management.docx
+++ b/specifications/TMFC003-ProductOrderDeliveryOrchestrationAndManagement/Diagrams/TMFC003_Product_Order_Delivery_Orchestration_and_Management.docx
@@ -788,6 +788,39 @@
           </w:p>
         </w:tc>
       </w:tr>
+      <w:tr>
+        <w:tc>
+          <w:tcPr>
+            <w:tcW w:type="dxa" w:w="2808"/>
+          </w:tcPr>
+          <w:p>
+            <w:r/>
+            <w:r>
+              <w:t>Customer Product Order</w:t>
+            </w:r>
+          </w:p>
+        </w:tc>
+        <w:tc>
+          <w:tcPr>
+            <w:tcW w:type="dxa" w:w="2995"/>
+          </w:tcPr>
+          <w:p>
+            <w:r/>
+            <w:r/>
+          </w:p>
+        </w:tc>
+        <w:tc>
+          <w:tcPr>
+            <w:tcW w:type="dxa" w:w="3557"/>
+          </w:tcPr>
+          <w:p>
+            <w:r/>
+            <w:r>
+              <w:t>Handles single customer orders and the various types thereof, such as regulated and non-regulated orders. / Orders ProductOfferings and concerns Products</w:t>
+            </w:r>
+          </w:p>
+        </w:tc>
+      </w:tr>
     </w:tbl>
     <w:p/>
     <w:p>
@@ -800,18 +833,38 @@
     </w:p>
     <w:p>
       <w:r>
-        <w:rPr>
-          <w:i/>
-        </w:rPr>
-        <w:t xml:space="preserve">no eTOM–SID links recorded for this component in </w:t>
-      </w:r>
-      <w:r>
-        <w:rPr>
-          <w:rFonts w:ascii="Consolas" w:hAnsi="Consolas"/>
-          <w:i/>
-          <w:sz w:val="18"/>
-        </w:rPr>
-        <w:t>TMFC003_eTOM_SID_Links.md</w:t>
+        <w:drawing>
+          <wp:inline xmlns:a="http://schemas.openxmlformats.org/drawingml/2006/main" xmlns:pic="http://schemas.openxmlformats.org/drawingml/2006/picture">
+            <wp:extent cx="5394960" cy="2361451"/>
+            <wp:docPr id="1" name="Picture 1"/>
+            <wp:cNvGraphicFramePr>
+              <a:graphicFrameLocks noChangeAspect="1"/>
+            </wp:cNvGraphicFramePr>
+            <a:graphic>
+              <a:graphicData uri="http://schemas.openxmlformats.org/drawingml/2006/picture">
+                <pic:pic>
+                  <pic:nvPicPr>
+                    <pic:cNvPr id="0" name="TMFC003_eTOM_SID.png"/>
+                    <pic:cNvPicPr/>
+                  </pic:nvPicPr>
+                  <pic:blipFill>
+                    <a:blip r:embed="rId47"/>
+                    <a:stretch>
+                      <a:fillRect/>
+                    </a:stretch>
+                  </pic:blipFill>
+                  <pic:spPr>
+                    <a:xfrm>
+                      <a:off x="0" y="0"/>
+                      <a:ext cx="5394960" cy="2361451"/>
+                    </a:xfrm>
+                    <a:prstGeom prst="rect"/>
+                  </pic:spPr>
+                </pic:pic>
+              </a:graphicData>
+            </a:graphic>
+          </wp:inline>
+        </w:drawing>
       </w:r>
     </w:p>
     <w:p>
@@ -3298,7 +3351,7 @@
         <w:drawing>
           <wp:inline xmlns:a="http://schemas.openxmlformats.org/drawingml/2006/main" xmlns:pic="http://schemas.openxmlformats.org/drawingml/2006/picture">
             <wp:extent cx="5394960" cy="6090904"/>
-            <wp:docPr id="1" name="Picture 1"/>
+            <wp:docPr id="2" name="Picture 2"/>
             <wp:cNvGraphicFramePr>
               <a:graphicFrameLocks noChangeAspect="1"/>
             </wp:cNvGraphicFramePr>
@@ -3310,7 +3363,7 @@
                     <pic:cNvPicPr/>
                   </pic:nvPicPr>
                   <pic:blipFill>
-                    <a:blip r:embed="rId47"/>
+                    <a:blip r:embed="rId48"/>
                     <a:stretch>
                       <a:fillRect/>
                     </a:stretch>
@@ -4316,7 +4369,7 @@
         <w:drawing>
           <wp:inline xmlns:a="http://schemas.openxmlformats.org/drawingml/2006/main" xmlns:pic="http://schemas.openxmlformats.org/drawingml/2006/picture">
             <wp:extent cx="5394960" cy="4398354"/>
-            <wp:docPr id="2" name="Picture 2"/>
+            <wp:docPr id="3" name="Picture 3"/>
             <wp:cNvGraphicFramePr>
               <a:graphicFrameLocks noChangeAspect="1"/>
             </wp:cNvGraphicFramePr>
@@ -4328,7 +4381,7 @@
                     <pic:cNvPicPr/>
                   </pic:nvPicPr>
                   <pic:blipFill>
-                    <a:blip r:embed="rId48"/>
+                    <a:blip r:embed="rId49"/>
                     <a:stretch>
                       <a:fillRect/>
                     </a:stretch>
@@ -8844,7 +8897,7 @@
         <w:drawing>
           <wp:inline xmlns:a="http://schemas.openxmlformats.org/drawingml/2006/main" xmlns:pic="http://schemas.openxmlformats.org/drawingml/2006/picture">
             <wp:extent cx="5394960" cy="6383760"/>
-            <wp:docPr id="3" name="Picture 3"/>
+            <wp:docPr id="4" name="Picture 4"/>
             <wp:cNvGraphicFramePr>
               <a:graphicFrameLocks noChangeAspect="1"/>
             </wp:cNvGraphicFramePr>
@@ -8856,7 +8909,7 @@
                     <pic:cNvPicPr/>
                   </pic:nvPicPr>
                   <pic:blipFill>
-                    <a:blip r:embed="rId49"/>
+                    <a:blip r:embed="rId50"/>
                     <a:stretch>
                       <a:fillRect/>
                     </a:stretch>
@@ -8880,7 +8933,7 @@
         <w:drawing>
           <wp:inline xmlns:a="http://schemas.openxmlformats.org/drawingml/2006/main" xmlns:pic="http://schemas.openxmlformats.org/drawingml/2006/picture">
             <wp:extent cx="5394960" cy="5776458"/>
-            <wp:docPr id="4" name="Picture 4"/>
+            <wp:docPr id="5" name="Picture 5"/>
             <wp:cNvGraphicFramePr>
               <a:graphicFrameLocks noChangeAspect="1"/>
             </wp:cNvGraphicFramePr>
@@ -8892,7 +8945,7 @@
                     <pic:cNvPicPr/>
                   </pic:nvPicPr>
                   <pic:blipFill>
-                    <a:blip r:embed="rId50"/>
+                    <a:blip r:embed="rId51"/>
                     <a:stretch>
                       <a:fillRect/>
                     </a:stretch>
@@ -8916,7 +8969,7 @@
         <w:drawing>
           <wp:inline xmlns:a="http://schemas.openxmlformats.org/drawingml/2006/main" xmlns:pic="http://schemas.openxmlformats.org/drawingml/2006/picture">
             <wp:extent cx="5394960" cy="4447993"/>
-            <wp:docPr id="5" name="Picture 5"/>
+            <wp:docPr id="6" name="Picture 6"/>
             <wp:cNvGraphicFramePr>
               <a:graphicFrameLocks noChangeAspect="1"/>
             </wp:cNvGraphicFramePr>
@@ -8928,7 +8981,7 @@
                     <pic:cNvPicPr/>
                   </pic:nvPicPr>
                   <pic:blipFill>
-                    <a:blip r:embed="rId51"/>
+                    <a:blip r:embed="rId52"/>
                     <a:stretch>
                       <a:fillRect/>
                     </a:stretch>
@@ -8994,7 +9047,7 @@
         </w:trPr>
         <w:tc>
           <w:tcPr>
-            <w:tcW w:type="dxa" w:w="1310"/>
+            <w:tcW w:type="dxa" w:w="1404"/>
           </w:tcPr>
           <w:p>
             <w:r/>
@@ -9008,7 +9061,7 @@
         </w:tc>
         <w:tc>
           <w:tcPr>
-            <w:tcW w:type="dxa" w:w="3650"/>
+            <w:tcW w:type="dxa" w:w="2995"/>
           </w:tcPr>
           <w:p>
             <w:r/>
@@ -9022,7 +9075,7 @@
         </w:tc>
         <w:tc>
           <w:tcPr>
-            <w:tcW w:type="dxa" w:w="4399"/>
+            <w:tcW w:type="dxa" w:w="4961"/>
           </w:tcPr>
           <w:p>
             <w:r/>
@@ -9038,32 +9091,60 @@
       <w:tr>
         <w:tc>
           <w:tcPr>
-            <w:tcW w:type="dxa" w:w="1310"/>
-          </w:tcPr>
-          <w:p>
-            <w:r/>
-            <w:r>
-              <w:t>TMF622</w:t>
-            </w:r>
-          </w:p>
-        </w:tc>
-        <w:tc>
-          <w:tcPr>
-            <w:tcW w:type="dxa" w:w="3650"/>
-          </w:tcPr>
-          <w:p>
-            <w:r/>
-            <w:r>
-              <w:t>Product Ordering Management API</w:t>
-            </w:r>
-          </w:p>
-        </w:tc>
-        <w:tc>
-          <w:tcPr>
-            <w:tcW w:type="dxa" w:w="4399"/>
-          </w:tcPr>
-          <w:p>
-            <w:r/>
+            <w:tcW w:type="dxa" w:w="1404"/>
+          </w:tcPr>
+          <w:p>
+            <w:r/>
+            <w:r/>
+          </w:p>
+        </w:tc>
+        <w:tc>
+          <w:tcPr>
+            <w:tcW w:type="dxa" w:w="2995"/>
+          </w:tcPr>
+          <w:p>
+            <w:r/>
+            <w:r>
+              <w:t>ProductOrder</w:t>
+            </w:r>
+          </w:p>
+        </w:tc>
+        <w:tc>
+          <w:tcPr>
+            <w:tcW w:type="dxa" w:w="4961"/>
+          </w:tcPr>
+          <w:p>
+            <w:r/>
+            <w:r>
+              <w:t>productOrderStateChangeEvent</w:t>
+            </w:r>
+            <w:r>
+              <w:br/>
+            </w:r>
+            <w:r>
+              <w:t>productOrderCreateEvent</w:t>
+            </w:r>
+            <w:r>
+              <w:br/>
+            </w:r>
+            <w:r>
+              <w:t>productOrderAttributeValueChangeEvent</w:t>
+            </w:r>
+            <w:r>
+              <w:br/>
+            </w:r>
+            <w:r>
+              <w:t>productOrderDeleteEvent</w:t>
+            </w:r>
+            <w:r>
+              <w:br/>
+            </w:r>
+            <w:r>
+              <w:t>productOrderInformationRequiredEvent</w:t>
+            </w:r>
+            <w:r>
+              <w:br/>
+            </w:r>
             <w:r>
               <w:t>cancelProductOrderCreateEvent</w:t>
             </w:r>
@@ -9071,43 +9152,13 @@
               <w:br/>
             </w:r>
             <w:r>
+              <w:t>cancelProductOrderStateChangeEvent</w:t>
+            </w:r>
+            <w:r>
+              <w:br/>
+            </w:r>
+            <w:r>
               <w:t>cancelProductOrderInformationRequiredEvent</w:t>
-            </w:r>
-            <w:r>
-              <w:br/>
-            </w:r>
-            <w:r>
-              <w:t>cancelProductOrderStateChangeEvent</w:t>
-            </w:r>
-            <w:r>
-              <w:br/>
-            </w:r>
-            <w:r>
-              <w:t>productOrderAttributeValueChangeEvent</w:t>
-            </w:r>
-            <w:r>
-              <w:br/>
-            </w:r>
-            <w:r>
-              <w:t>productOrderCreateEvent</w:t>
-            </w:r>
-            <w:r>
-              <w:br/>
-            </w:r>
-            <w:r>
-              <w:t>productOrderDeleteEvent</w:t>
-            </w:r>
-            <w:r>
-              <w:br/>
-            </w:r>
-            <w:r>
-              <w:t>productOrderInformationRequiredEvent</w:t>
-            </w:r>
-            <w:r>
-              <w:br/>
-            </w:r>
-            <w:r>
-              <w:t>productOrderStateChangeEvent</w:t>
             </w:r>
           </w:p>
         </w:tc>
@@ -9115,32 +9166,129 @@
       <w:tr>
         <w:tc>
           <w:tcPr>
-            <w:tcW w:type="dxa" w:w="1310"/>
-          </w:tcPr>
-          <w:p>
-            <w:r/>
-            <w:r>
-              <w:t>TMF701</w:t>
-            </w:r>
-          </w:p>
-        </w:tc>
-        <w:tc>
-          <w:tcPr>
-            <w:tcW w:type="dxa" w:w="3650"/>
-          </w:tcPr>
-          <w:p>
-            <w:r/>
-            <w:r>
-              <w:t>Process Management API</w:t>
-            </w:r>
-          </w:p>
-        </w:tc>
-        <w:tc>
-          <w:tcPr>
-            <w:tcW w:type="dxa" w:w="4399"/>
-          </w:tcPr>
-          <w:p>
-            <w:r/>
+            <w:tcW w:type="dxa" w:w="1404"/>
+          </w:tcPr>
+          <w:p>
+            <w:r/>
+            <w:r/>
+          </w:p>
+        </w:tc>
+        <w:tc>
+          <w:tcPr>
+            <w:tcW w:type="dxa" w:w="2995"/>
+          </w:tcPr>
+          <w:p>
+            <w:r/>
+            <w:r>
+              <w:t>ProcessFlowManagement</w:t>
+            </w:r>
+          </w:p>
+        </w:tc>
+        <w:tc>
+          <w:tcPr>
+            <w:tcW w:type="dxa" w:w="4961"/>
+          </w:tcPr>
+          <w:p>
+            <w:r/>
+            <w:r>
+              <w:t>processFlowCreateEvent</w:t>
+            </w:r>
+            <w:r>
+              <w:br/>
+            </w:r>
+            <w:r>
+              <w:t>processFlowStateChangeEvent</w:t>
+            </w:r>
+            <w:r>
+              <w:br/>
+            </w:r>
+            <w:r>
+              <w:t>processFlowDeleteEvent</w:t>
+            </w:r>
+            <w:r>
+              <w:br/>
+            </w:r>
+            <w:r>
+              <w:t>processFlowAttributeValueChangeEvent</w:t>
+            </w:r>
+            <w:r>
+              <w:br/>
+            </w:r>
+            <w:r>
+              <w:t>taskFlowCreateEvent</w:t>
+            </w:r>
+            <w:r>
+              <w:br/>
+            </w:r>
+            <w:r>
+              <w:t>taskFlowStateChangeEvent</w:t>
+            </w:r>
+            <w:r>
+              <w:br/>
+            </w:r>
+            <w:r>
+              <w:t>taskFlowDeleteEvent</w:t>
+            </w:r>
+            <w:r>
+              <w:br/>
+            </w:r>
+            <w:r>
+              <w:t>taskFlowAttributeValueChangeEvent</w:t>
+            </w:r>
+            <w:r>
+              <w:br/>
+            </w:r>
+            <w:r>
+              <w:t>taskFlowInformationRequiredEvent</w:t>
+            </w:r>
+          </w:p>
+        </w:tc>
+      </w:tr>
+      <w:tr>
+        <w:tc>
+          <w:tcPr>
+            <w:tcW w:type="dxa" w:w="1404"/>
+          </w:tcPr>
+          <w:p>
+            <w:r/>
+            <w:r/>
+          </w:p>
+        </w:tc>
+        <w:tc>
+          <w:tcPr>
+            <w:tcW w:type="dxa" w:w="2995"/>
+          </w:tcPr>
+          <w:p>
+            <w:r/>
+            <w:r>
+              <w:t>ProcessManagement</w:t>
+            </w:r>
+          </w:p>
+        </w:tc>
+        <w:tc>
+          <w:tcPr>
+            <w:tcW w:type="dxa" w:w="4961"/>
+          </w:tcPr>
+          <w:p>
+            <w:r/>
+            <w:r>
+              <w:t>processCreateEvent</w:t>
+            </w:r>
+            <w:r>
+              <w:br/>
+            </w:r>
+            <w:r>
+              <w:t>processStateChangeEvent</w:t>
+            </w:r>
+            <w:r>
+              <w:br/>
+            </w:r>
+            <w:r>
+              <w:t>processDeleteEvent</w:t>
+            </w:r>
+            <w:r>
+              <w:br/>
+            </w:r>
             <w:r>
               <w:t>processAttributeValueChangeEvent</w:t>
             </w:r>
@@ -9148,37 +9296,31 @@
               <w:br/>
             </w:r>
             <w:r>
-              <w:t>processCreateEvent</w:t>
-            </w:r>
-            <w:r>
-              <w:br/>
-            </w:r>
-            <w:r>
-              <w:t>processDeleteEvent</w:t>
-            </w:r>
-            <w:r>
-              <w:br/>
-            </w:r>
-            <w:r>
-              <w:t>processFlowAttributeValueChangeEvent</w:t>
-            </w:r>
-            <w:r>
-              <w:br/>
-            </w:r>
-            <w:r>
-              <w:t>processFlowCreateEvent</w:t>
-            </w:r>
-            <w:r>
-              <w:br/>
-            </w:r>
-            <w:r>
-              <w:t>processFlowDeleteEvent</w:t>
-            </w:r>
-            <w:r>
-              <w:br/>
-            </w:r>
-            <w:r>
-              <w:t>processFlowStateChangeEvent</w:t>
+              <w:t>taskCreateEvent</w:t>
+            </w:r>
+            <w:r>
+              <w:br/>
+            </w:r>
+            <w:r>
+              <w:t>taskStateChangeEvent</w:t>
+            </w:r>
+            <w:r>
+              <w:br/>
+            </w:r>
+            <w:r>
+              <w:t>taskDeleteEvent</w:t>
+            </w:r>
+            <w:r>
+              <w:br/>
+            </w:r>
+            <w:r>
+              <w:t>taskAttributeValueChangeEvent</w:t>
+            </w:r>
+            <w:r>
+              <w:br/>
+            </w:r>
+            <w:r>
+              <w:t>taskInformationRequiredEvent</w:t>
             </w:r>
             <w:r>
               <w:br/>
@@ -9208,66 +9350,6 @@
               <w:br/>
             </w:r>
             <w:r>
-              <w:t>processStateChangeEvent</w:t>
-            </w:r>
-            <w:r>
-              <w:br/>
-            </w:r>
-            <w:r>
-              <w:t>taskAttributeValueChangeEvent</w:t>
-            </w:r>
-            <w:r>
-              <w:br/>
-            </w:r>
-            <w:r>
-              <w:t>taskCreateEvent</w:t>
-            </w:r>
-            <w:r>
-              <w:br/>
-            </w:r>
-            <w:r>
-              <w:t>taskDeleteEvent</w:t>
-            </w:r>
-            <w:r>
-              <w:br/>
-            </w:r>
-            <w:r>
-              <w:t>taskFlowAttributeValueChangeEvent</w:t>
-            </w:r>
-            <w:r>
-              <w:br/>
-            </w:r>
-            <w:r>
-              <w:t>taskFlowCreateEvent</w:t>
-            </w:r>
-            <w:r>
-              <w:br/>
-            </w:r>
-            <w:r>
-              <w:t>taskFlowDeleteEvent</w:t>
-            </w:r>
-            <w:r>
-              <w:br/>
-            </w:r>
-            <w:r>
-              <w:t>taskFlowInformationRequiredEvent</w:t>
-            </w:r>
-            <w:r>
-              <w:br/>
-            </w:r>
-            <w:r>
-              <w:t>taskFlowStateChangeEvent</w:t>
-            </w:r>
-            <w:r>
-              <w:br/>
-            </w:r>
-            <w:r>
-              <w:t>taskInformationRequiredEvent</w:t>
-            </w:r>
-            <w:r>
-              <w:br/>
-            </w:r>
-            <w:r>
               <w:t>taskSpecificationAttributeValueChangeEvent</w:t>
             </w:r>
             <w:r>
@@ -9287,12 +9369,6 @@
             </w:r>
             <w:r>
               <w:t>taskSpecificationStateChangeEvent</w:t>
-            </w:r>
-            <w:r>
-              <w:br/>
-            </w:r>
-            <w:r>
-              <w:t>taskStateChangeEvent</w:t>
             </w:r>
           </w:p>
         </w:tc>
@@ -9303,8 +9379,8 @@
       <w:r>
         <w:drawing>
           <wp:inline xmlns:a="http://schemas.openxmlformats.org/drawingml/2006/main" xmlns:pic="http://schemas.openxmlformats.org/drawingml/2006/picture">
-            <wp:extent cx="5394960" cy="3896360"/>
-            <wp:docPr id="6" name="Picture 6"/>
+            <wp:extent cx="5394960" cy="4273632"/>
+            <wp:docPr id="7" name="Picture 7"/>
             <wp:cNvGraphicFramePr>
               <a:graphicFrameLocks noChangeAspect="1"/>
             </wp:cNvGraphicFramePr>
@@ -9316,7 +9392,7 @@
                     <pic:cNvPicPr/>
                   </pic:nvPicPr>
                   <pic:blipFill>
-                    <a:blip r:embed="rId52"/>
+                    <a:blip r:embed="rId53"/>
                     <a:stretch>
                       <a:fillRect/>
                     </a:stretch>
@@ -9324,7 +9400,7 @@
                   <pic:spPr>
                     <a:xfrm>
                       <a:off x="0" y="0"/>
-                      <a:ext cx="5394960" cy="3896360"/>
+                      <a:ext cx="5394960" cy="4273632"/>
                     </a:xfrm>
                     <a:prstGeom prst="rect"/>
                   </pic:spPr>
@@ -9369,7 +9445,7 @@
         </w:trPr>
         <w:tc>
           <w:tcPr>
-            <w:tcW w:type="dxa" w:w="1217"/>
+            <w:tcW w:type="dxa" w:w="1310"/>
           </w:tcPr>
           <w:p>
             <w:r/>
@@ -9383,7 +9459,7 @@
         </w:tc>
         <w:tc>
           <w:tcPr>
-            <w:tcW w:type="dxa" w:w="4025"/>
+            <w:tcW w:type="dxa" w:w="3463"/>
           </w:tcPr>
           <w:p>
             <w:r/>
@@ -9397,7 +9473,7 @@
         </w:tc>
         <w:tc>
           <w:tcPr>
-            <w:tcW w:type="dxa" w:w="4118"/>
+            <w:tcW w:type="dxa" w:w="4586"/>
           </w:tcPr>
           <w:p>
             <w:r/>
@@ -9413,46 +9489,74 @@
       <w:tr>
         <w:tc>
           <w:tcPr>
-            <w:tcW w:type="dxa" w:w="1217"/>
-          </w:tcPr>
-          <w:p>
-            <w:r/>
-            <w:r>
-              <w:t>TMF620</w:t>
-            </w:r>
-          </w:p>
-        </w:tc>
-        <w:tc>
-          <w:tcPr>
-            <w:tcW w:type="dxa" w:w="4025"/>
-          </w:tcPr>
-          <w:p>
-            <w:r/>
-            <w:r>
-              <w:t>Product Catalog Management API</w:t>
-            </w:r>
-          </w:p>
-        </w:tc>
-        <w:tc>
-          <w:tcPr>
-            <w:tcW w:type="dxa" w:w="4118"/>
-          </w:tcPr>
-          <w:p>
-            <w:r/>
-            <w:r>
-              <w:t>productOfferingDeleteEvent</w:t>
-            </w:r>
-            <w:r>
-              <w:br/>
-            </w:r>
-            <w:r>
-              <w:t>productOfferingPriceDeleteEvent</w:t>
-            </w:r>
-            <w:r>
-              <w:br/>
-            </w:r>
-            <w:r>
-              <w:t>productSpecificationDeleteEvent</w:t>
+            <w:tcW w:type="dxa" w:w="1310"/>
+          </w:tcPr>
+          <w:p>
+            <w:r/>
+            <w:r/>
+          </w:p>
+        </w:tc>
+        <w:tc>
+          <w:tcPr>
+            <w:tcW w:type="dxa" w:w="3463"/>
+          </w:tcPr>
+          <w:p>
+            <w:r/>
+            <w:r>
+              <w:t>ServiceOrder</w:t>
+            </w:r>
+          </w:p>
+        </w:tc>
+        <w:tc>
+          <w:tcPr>
+            <w:tcW w:type="dxa" w:w="4586"/>
+          </w:tcPr>
+          <w:p>
+            <w:r/>
+            <w:r>
+              <w:t>serviceOrderAttributeValueChangeEvent</w:t>
+            </w:r>
+            <w:r>
+              <w:br/>
+            </w:r>
+            <w:r>
+              <w:t>serviceOrderInformationRequiredEvent</w:t>
+            </w:r>
+            <w:r>
+              <w:br/>
+            </w:r>
+            <w:r>
+              <w:t>serviceOrderMilestoneEvent</w:t>
+            </w:r>
+            <w:r>
+              <w:br/>
+            </w:r>
+            <w:r>
+              <w:t>serviceOrderJeopardyEvent</w:t>
+            </w:r>
+            <w:r>
+              <w:br/>
+            </w:r>
+            <w:r>
+              <w:t>serviceOrderDeleteEvent</w:t>
+            </w:r>
+            <w:r>
+              <w:br/>
+            </w:r>
+            <w:r>
+              <w:t>cancelServiceOrderStateChangeEvent</w:t>
+            </w:r>
+            <w:r>
+              <w:br/>
+            </w:r>
+            <w:r>
+              <w:t>cancelServiceOrderInformationRequiredEvent</w:t>
+            </w:r>
+            <w:r>
+              <w:br/>
+            </w:r>
+            <w:r>
+              <w:t>serviceOrderStateChangeEvent</w:t>
             </w:r>
           </w:p>
         </w:tc>
@@ -9460,40 +9564,56 @@
       <w:tr>
         <w:tc>
           <w:tcPr>
-            <w:tcW w:type="dxa" w:w="1217"/>
-          </w:tcPr>
-          <w:p>
-            <w:r/>
-            <w:r>
-              <w:t>TMF632</w:t>
-            </w:r>
-          </w:p>
-        </w:tc>
-        <w:tc>
-          <w:tcPr>
-            <w:tcW w:type="dxa" w:w="4025"/>
-          </w:tcPr>
-          <w:p>
-            <w:r/>
-            <w:r>
-              <w:t>Party Management API</w:t>
-            </w:r>
-          </w:p>
-        </w:tc>
-        <w:tc>
-          <w:tcPr>
-            <w:tcW w:type="dxa" w:w="4118"/>
-          </w:tcPr>
-          <w:p>
-            <w:r/>
-            <w:r>
-              <w:t>individualDeleteEvent</w:t>
-            </w:r>
-            <w:r>
-              <w:br/>
-            </w:r>
-            <w:r>
-              <w:t>organizationDeleteEvent</w:t>
+            <w:tcW w:type="dxa" w:w="1310"/>
+          </w:tcPr>
+          <w:p>
+            <w:r/>
+            <w:r/>
+          </w:p>
+        </w:tc>
+        <w:tc>
+          <w:tcPr>
+            <w:tcW w:type="dxa" w:w="3463"/>
+          </w:tcPr>
+          <w:p>
+            <w:r/>
+            <w:r>
+              <w:t>ResourceOrder</w:t>
+            </w:r>
+          </w:p>
+        </w:tc>
+        <w:tc>
+          <w:tcPr>
+            <w:tcW w:type="dxa" w:w="4586"/>
+          </w:tcPr>
+          <w:p>
+            <w:r/>
+            <w:r>
+              <w:t>resourceOrderStateChange</w:t>
+            </w:r>
+            <w:r>
+              <w:br/>
+            </w:r>
+            <w:r>
+              <w:t>resourceOrderAttributeValueChangeEvent</w:t>
+            </w:r>
+            <w:r>
+              <w:br/>
+            </w:r>
+            <w:r>
+              <w:t>resourceOrderInformationRequiredEvent</w:t>
+            </w:r>
+            <w:r>
+              <w:br/>
+            </w:r>
+            <w:r>
+              <w:t>cancelResourceOrderStateChange</w:t>
+            </w:r>
+            <w:r>
+              <w:br/>
+            </w:r>
+            <w:r>
+              <w:t>cancelResourceOrderInformationRequiredEvent</w:t>
             </w:r>
           </w:p>
         </w:tc>
@@ -9501,34 +9621,44 @@
       <w:tr>
         <w:tc>
           <w:tcPr>
-            <w:tcW w:type="dxa" w:w="1217"/>
-          </w:tcPr>
-          <w:p>
-            <w:r/>
-            <w:r>
-              <w:t>TMF633</w:t>
-            </w:r>
-          </w:p>
-        </w:tc>
-        <w:tc>
-          <w:tcPr>
-            <w:tcW w:type="dxa" w:w="4025"/>
-          </w:tcPr>
-          <w:p>
-            <w:r/>
-            <w:r>
-              <w:t>Service Catalog Management API</w:t>
-            </w:r>
-          </w:p>
-        </w:tc>
-        <w:tc>
-          <w:tcPr>
-            <w:tcW w:type="dxa" w:w="4118"/>
-          </w:tcPr>
-          <w:p>
-            <w:r/>
-            <w:r>
-              <w:t>serviceSpecificationDeleteEvent</w:t>
+            <w:tcW w:type="dxa" w:w="1310"/>
+          </w:tcPr>
+          <w:p>
+            <w:r/>
+            <w:r/>
+          </w:p>
+        </w:tc>
+        <w:tc>
+          <w:tcPr>
+            <w:tcW w:type="dxa" w:w="3463"/>
+          </w:tcPr>
+          <w:p>
+            <w:r/>
+            <w:r>
+              <w:t>GeographicLocation</w:t>
+            </w:r>
+          </w:p>
+        </w:tc>
+        <w:tc>
+          <w:tcPr>
+            <w:tcW w:type="dxa" w:w="4586"/>
+          </w:tcPr>
+          <w:p>
+            <w:r/>
+            <w:r>
+              <w:t>geographicLocationCreateEvent</w:t>
+            </w:r>
+            <w:r>
+              <w:br/>
+            </w:r>
+            <w:r>
+              <w:t>geographicLocationAttributeValueChangeEvent</w:t>
+            </w:r>
+            <w:r>
+              <w:br/>
+            </w:r>
+            <w:r>
+              <w:t>geographicLocationDeleteEvent</w:t>
             </w:r>
           </w:p>
         </w:tc>
@@ -9536,34 +9666,56 @@
       <w:tr>
         <w:tc>
           <w:tcPr>
-            <w:tcW w:type="dxa" w:w="1217"/>
-          </w:tcPr>
-          <w:p>
-            <w:r/>
-            <w:r>
-              <w:t>TMF634</w:t>
-            </w:r>
-          </w:p>
-        </w:tc>
-        <w:tc>
-          <w:tcPr>
-            <w:tcW w:type="dxa" w:w="4025"/>
-          </w:tcPr>
-          <w:p>
-            <w:r/>
-            <w:r>
-              <w:t>Resource Catalog Management API</w:t>
-            </w:r>
-          </w:p>
-        </w:tc>
-        <w:tc>
-          <w:tcPr>
-            <w:tcW w:type="dxa" w:w="4118"/>
-          </w:tcPr>
-          <w:p>
-            <w:r/>
-            <w:r>
-              <w:t>resourceSpecificationDeleteEvent</w:t>
+            <w:tcW w:type="dxa" w:w="1310"/>
+          </w:tcPr>
+          <w:p>
+            <w:r/>
+            <w:r/>
+          </w:p>
+        </w:tc>
+        <w:tc>
+          <w:tcPr>
+            <w:tcW w:type="dxa" w:w="3463"/>
+          </w:tcPr>
+          <w:p>
+            <w:r/>
+            <w:r>
+              <w:t>GeographicSiteManagement</w:t>
+            </w:r>
+          </w:p>
+        </w:tc>
+        <w:tc>
+          <w:tcPr>
+            <w:tcW w:type="dxa" w:w="4586"/>
+          </w:tcPr>
+          <w:p>
+            <w:r/>
+            <w:r>
+              <w:t>geographicSiteCreateEvent</w:t>
+            </w:r>
+            <w:r>
+              <w:br/>
+            </w:r>
+            <w:r>
+              <w:t>geographicSiteAttributeValueChangeEvent</w:t>
+            </w:r>
+            <w:r>
+              <w:br/>
+            </w:r>
+            <w:r>
+              <w:t>geographicSiteDeleteEvent</w:t>
+            </w:r>
+            <w:r>
+              <w:br/>
+            </w:r>
+            <w:r>
+              <w:t>geographicSiteStatusChangeEvent</w:t>
+            </w:r>
+            <w:r>
+              <w:br/>
+            </w:r>
+            <w:r>
+              <w:t>geographicSiteStateChangeEvent</w:t>
             </w:r>
           </w:p>
         </w:tc>
@@ -9571,58 +9723,50 @@
       <w:tr>
         <w:tc>
           <w:tcPr>
-            <w:tcW w:type="dxa" w:w="1217"/>
-          </w:tcPr>
-          <w:p>
-            <w:r/>
-            <w:r>
-              <w:t>TMF637</w:t>
-            </w:r>
-          </w:p>
-        </w:tc>
-        <w:tc>
-          <w:tcPr>
-            <w:tcW w:type="dxa" w:w="4025"/>
-          </w:tcPr>
-          <w:p>
-            <w:r/>
-            <w:r>
-              <w:t>Product Inventory Management API</w:t>
-            </w:r>
-          </w:p>
-        </w:tc>
-        <w:tc>
-          <w:tcPr>
-            <w:tcW w:type="dxa" w:w="4118"/>
-          </w:tcPr>
-          <w:p>
-            <w:r/>
-            <w:r>
-              <w:t>productAttributeValueChangeEvent</w:t>
-            </w:r>
-            <w:r>
-              <w:br/>
-            </w:r>
-            <w:r>
-              <w:t>productBatchEvent</w:t>
-            </w:r>
-            <w:r>
-              <w:br/>
-            </w:r>
-            <w:r>
-              <w:t>productCreateEvent</w:t>
-            </w:r>
-            <w:r>
-              <w:br/>
-            </w:r>
-            <w:r>
-              <w:t>productDeleteEvent</w:t>
-            </w:r>
-            <w:r>
-              <w:br/>
-            </w:r>
-            <w:r>
-              <w:t>productStateChangeEvent</w:t>
+            <w:tcW w:type="dxa" w:w="1310"/>
+          </w:tcPr>
+          <w:p>
+            <w:r/>
+            <w:r/>
+          </w:p>
+        </w:tc>
+        <w:tc>
+          <w:tcPr>
+            <w:tcW w:type="dxa" w:w="3463"/>
+          </w:tcPr>
+          <w:p>
+            <w:r/>
+            <w:r>
+              <w:t>GeographicAddressManagement</w:t>
+            </w:r>
+          </w:p>
+        </w:tc>
+        <w:tc>
+          <w:tcPr>
+            <w:tcW w:type="dxa" w:w="4586"/>
+          </w:tcPr>
+          <w:p>
+            <w:r/>
+            <w:r>
+              <w:t>geographicAddressValidationStateChangeEvent</w:t>
+            </w:r>
+            <w:r>
+              <w:br/>
+            </w:r>
+            <w:r>
+              <w:t>geographicAddressAttributeValueChangeEvent</w:t>
+            </w:r>
+            <w:r>
+              <w:br/>
+            </w:r>
+            <w:r>
+              <w:t>geographicAddressCreateEvent</w:t>
+            </w:r>
+            <w:r>
+              <w:br/>
+            </w:r>
+            <w:r>
+              <w:t>geographicAddressDeleteEvent</w:t>
             </w:r>
           </w:p>
         </w:tc>
@@ -9630,34 +9774,50 @@
       <w:tr>
         <w:tc>
           <w:tcPr>
-            <w:tcW w:type="dxa" w:w="1217"/>
-          </w:tcPr>
-          <w:p>
-            <w:r/>
-            <w:r>
-              <w:t>TMF638</w:t>
-            </w:r>
-          </w:p>
-        </w:tc>
-        <w:tc>
-          <w:tcPr>
-            <w:tcW w:type="dxa" w:w="4025"/>
-          </w:tcPr>
-          <w:p>
-            <w:r/>
-            <w:r>
-              <w:t>Service Inventory Management API</w:t>
-            </w:r>
-          </w:p>
-        </w:tc>
-        <w:tc>
-          <w:tcPr>
-            <w:tcW w:type="dxa" w:w="4118"/>
-          </w:tcPr>
-          <w:p>
-            <w:r/>
-            <w:r>
-              <w:t>serviceDeleteEvent</w:t>
+            <w:tcW w:type="dxa" w:w="1310"/>
+          </w:tcPr>
+          <w:p>
+            <w:r/>
+            <w:r/>
+          </w:p>
+        </w:tc>
+        <w:tc>
+          <w:tcPr>
+            <w:tcW w:type="dxa" w:w="3463"/>
+          </w:tcPr>
+          <w:p>
+            <w:r/>
+            <w:r>
+              <w:t>IntentManagement</w:t>
+            </w:r>
+          </w:p>
+        </w:tc>
+        <w:tc>
+          <w:tcPr>
+            <w:tcW w:type="dxa" w:w="4586"/>
+          </w:tcPr>
+          <w:p>
+            <w:r/>
+            <w:r>
+              <w:t>intentCreateEvent</w:t>
+            </w:r>
+            <w:r>
+              <w:br/>
+            </w:r>
+            <w:r>
+              <w:t>intentStatusChangeEvent</w:t>
+            </w:r>
+            <w:r>
+              <w:br/>
+            </w:r>
+            <w:r>
+              <w:t>intentDeleteEvent</w:t>
+            </w:r>
+            <w:r>
+              <w:br/>
+            </w:r>
+            <w:r>
+              <w:t>intentAttributeValueChangeEvent</w:t>
             </w:r>
           </w:p>
         </w:tc>
@@ -9665,34 +9825,50 @@
       <w:tr>
         <w:tc>
           <w:tcPr>
-            <w:tcW w:type="dxa" w:w="1217"/>
-          </w:tcPr>
-          <w:p>
-            <w:r/>
-            <w:r>
-              <w:t>TMF639</w:t>
-            </w:r>
-          </w:p>
-        </w:tc>
-        <w:tc>
-          <w:tcPr>
-            <w:tcW w:type="dxa" w:w="4025"/>
-          </w:tcPr>
-          <w:p>
-            <w:r/>
-            <w:r>
-              <w:t>Resource Inventory Management API</w:t>
-            </w:r>
-          </w:p>
-        </w:tc>
-        <w:tc>
-          <w:tcPr>
-            <w:tcW w:type="dxa" w:w="4118"/>
-          </w:tcPr>
-          <w:p>
-            <w:r/>
-            <w:r>
-              <w:t>resourceDeleteEvent</w:t>
+            <w:tcW w:type="dxa" w:w="1310"/>
+          </w:tcPr>
+          <w:p>
+            <w:r/>
+            <w:r/>
+          </w:p>
+        </w:tc>
+        <w:tc>
+          <w:tcPr>
+            <w:tcW w:type="dxa" w:w="3463"/>
+          </w:tcPr>
+          <w:p>
+            <w:r/>
+            <w:r>
+              <w:t>AppointmentManagement</w:t>
+            </w:r>
+          </w:p>
+        </w:tc>
+        <w:tc>
+          <w:tcPr>
+            <w:tcW w:type="dxa" w:w="4586"/>
+          </w:tcPr>
+          <w:p>
+            <w:r/>
+            <w:r>
+              <w:t>appointmentStateChange</w:t>
+            </w:r>
+            <w:r>
+              <w:br/>
+            </w:r>
+            <w:r>
+              <w:t>appointmentCreateEvent</w:t>
+            </w:r>
+            <w:r>
+              <w:br/>
+            </w:r>
+            <w:r>
+              <w:t>appointmentAttributeValueChangeEvent</w:t>
+            </w:r>
+            <w:r>
+              <w:br/>
+            </w:r>
+            <w:r>
+              <w:t>appointmentDeleteEvent</w:t>
             </w:r>
           </w:p>
         </w:tc>
@@ -9700,76 +9876,80 @@
       <w:tr>
         <w:tc>
           <w:tcPr>
-            <w:tcW w:type="dxa" w:w="1217"/>
-          </w:tcPr>
-          <w:p>
-            <w:r/>
-            <w:r>
-              <w:t>TMF641</w:t>
-            </w:r>
-          </w:p>
-        </w:tc>
-        <w:tc>
-          <w:tcPr>
-            <w:tcW w:type="dxa" w:w="4025"/>
-          </w:tcPr>
-          <w:p>
-            <w:r/>
-            <w:r>
-              <w:t>Service Ordering Management API</w:t>
-            </w:r>
-          </w:p>
-        </w:tc>
-        <w:tc>
-          <w:tcPr>
-            <w:tcW w:type="dxa" w:w="4118"/>
-          </w:tcPr>
-          <w:p>
-            <w:r/>
-            <w:r>
-              <w:t>cancelServiceOrderInformationRequiredEvent</w:t>
-            </w:r>
-            <w:r>
-              <w:br/>
-            </w:r>
-            <w:r>
-              <w:t>cancelServiceOrderStateChangeEvent</w:t>
-            </w:r>
-            <w:r>
-              <w:br/>
-            </w:r>
-            <w:r>
-              <w:t>serviceOrderAttributeValueChangeEvent</w:t>
-            </w:r>
-            <w:r>
-              <w:br/>
-            </w:r>
-            <w:r>
-              <w:t>serviceOrderDeleteEvent</w:t>
-            </w:r>
-            <w:r>
-              <w:br/>
-            </w:r>
-            <w:r>
-              <w:t>serviceOrderInformationRequiredEvent</w:t>
-            </w:r>
-            <w:r>
-              <w:br/>
-            </w:r>
-            <w:r>
-              <w:t>serviceOrderJeopardyEvent</w:t>
-            </w:r>
-            <w:r>
-              <w:br/>
-            </w:r>
-            <w:r>
-              <w:t>serviceOrderMilestoneEvent</w:t>
-            </w:r>
-            <w:r>
-              <w:br/>
-            </w:r>
-            <w:r>
-              <w:t>serviceOrderStateChangeEvent</w:t>
+            <w:tcW w:type="dxa" w:w="1310"/>
+          </w:tcPr>
+          <w:p>
+            <w:r/>
+            <w:r/>
+          </w:p>
+        </w:tc>
+        <w:tc>
+          <w:tcPr>
+            <w:tcW w:type="dxa" w:w="3463"/>
+          </w:tcPr>
+          <w:p>
+            <w:r/>
+            <w:r>
+              <w:t>ProductOfferingQualification</w:t>
+            </w:r>
+          </w:p>
+        </w:tc>
+        <w:tc>
+          <w:tcPr>
+            <w:tcW w:type="dxa" w:w="4586"/>
+          </w:tcPr>
+          <w:p>
+            <w:r/>
+            <w:r>
+              <w:t>productOfferingQualificationCreateEvent</w:t>
+            </w:r>
+            <w:r>
+              <w:br/>
+            </w:r>
+            <w:r>
+              <w:t>productOfferingQualificationAttributeValueChangeEvent</w:t>
+            </w:r>
+            <w:r>
+              <w:br/>
+            </w:r>
+            <w:r>
+              <w:t>productOfferingQualificationStateChangeEvent</w:t>
+            </w:r>
+            <w:r>
+              <w:br/>
+            </w:r>
+            <w:r>
+              <w:t>productOfferingQualificationDeleteEvent</w:t>
+            </w:r>
+            <w:r>
+              <w:br/>
+            </w:r>
+            <w:r>
+              <w:t>productOfferingQualificationInformationRequiredEvent</w:t>
+            </w:r>
+            <w:r>
+              <w:br/>
+            </w:r>
+            <w:r>
+              <w:t>checkProductOfferingQualificationCreateEvent</w:t>
+            </w:r>
+            <w:r>
+              <w:br/>
+            </w:r>
+            <w:r>
+              <w:t>checkProductOfferingQualificationAttributeValueChangeEvent</w:t>
+            </w:r>
+            <w:r>
+              <w:br/>
+            </w:r>
+            <w:r>
+              <w:t>checkProductOfferingQualificationStateChangeEvent</w:t>
+            </w:r>
+            <w:r>
+              <w:br/>
+            </w:r>
+            <w:r>
+              <w:t>checkProductOfferingQualificationDeleteEvent</w:t>
             </w:r>
           </w:p>
         </w:tc>
@@ -9777,52 +9957,38 @@
       <w:tr>
         <w:tc>
           <w:tcPr>
-            <w:tcW w:type="dxa" w:w="1217"/>
-          </w:tcPr>
-          <w:p>
-            <w:r/>
-            <w:r>
-              <w:t>TMF646</w:t>
-            </w:r>
-          </w:p>
-        </w:tc>
-        <w:tc>
-          <w:tcPr>
-            <w:tcW w:type="dxa" w:w="4025"/>
-          </w:tcPr>
-          <w:p>
-            <w:r/>
-            <w:r>
-              <w:t>Appointment Management API</w:t>
-            </w:r>
-          </w:p>
-        </w:tc>
-        <w:tc>
-          <w:tcPr>
-            <w:tcW w:type="dxa" w:w="4118"/>
-          </w:tcPr>
-          <w:p>
-            <w:r/>
-            <w:r>
-              <w:t>appointmentAttributeValueChangeEvent</w:t>
-            </w:r>
-            <w:r>
-              <w:br/>
-            </w:r>
-            <w:r>
-              <w:t>appointmentCreateEvent</w:t>
-            </w:r>
-            <w:r>
-              <w:br/>
-            </w:r>
-            <w:r>
-              <w:t>appointmentDeleteEvent</w:t>
-            </w:r>
-            <w:r>
-              <w:br/>
-            </w:r>
-            <w:r>
-              <w:t>appointmentStateChange</w:t>
+            <w:tcW w:type="dxa" w:w="1310"/>
+          </w:tcPr>
+          <w:p>
+            <w:r/>
+            <w:r/>
+          </w:p>
+        </w:tc>
+        <w:tc>
+          <w:tcPr>
+            <w:tcW w:type="dxa" w:w="3463"/>
+          </w:tcPr>
+          <w:p>
+            <w:r/>
+            <w:r>
+              <w:t>PartyManagement</w:t>
+            </w:r>
+          </w:p>
+        </w:tc>
+        <w:tc>
+          <w:tcPr>
+            <w:tcW w:type="dxa" w:w="4586"/>
+          </w:tcPr>
+          <w:p>
+            <w:r/>
+            <w:r>
+              <w:t>individualDeleteEvent</w:t>
+            </w:r>
+            <w:r>
+              <w:br/>
+            </w:r>
+            <w:r>
+              <w:t>organizationDeleteEvent</w:t>
             </w:r>
           </w:p>
         </w:tc>
@@ -9830,34 +9996,38 @@
       <w:tr>
         <w:tc>
           <w:tcPr>
-            <w:tcW w:type="dxa" w:w="1217"/>
-          </w:tcPr>
-          <w:p>
-            <w:r/>
-            <w:r>
-              <w:t>TMF648</w:t>
-            </w:r>
-          </w:p>
-        </w:tc>
-        <w:tc>
-          <w:tcPr>
-            <w:tcW w:type="dxa" w:w="4025"/>
-          </w:tcPr>
-          <w:p>
-            <w:r/>
-            <w:r>
-              <w:t>Quote Management API</w:t>
-            </w:r>
-          </w:p>
-        </w:tc>
-        <w:tc>
-          <w:tcPr>
-            <w:tcW w:type="dxa" w:w="4118"/>
-          </w:tcPr>
-          <w:p>
-            <w:r/>
-            <w:r>
-              <w:t>quoteDeleteEvent</w:t>
+            <w:tcW w:type="dxa" w:w="1310"/>
+          </w:tcPr>
+          <w:p>
+            <w:r/>
+            <w:r/>
+          </w:p>
+        </w:tc>
+        <w:tc>
+          <w:tcPr>
+            <w:tcW w:type="dxa" w:w="3463"/>
+          </w:tcPr>
+          <w:p>
+            <w:r/>
+            <w:r>
+              <w:t>PartyRoleManagement</w:t>
+            </w:r>
+          </w:p>
+        </w:tc>
+        <w:tc>
+          <w:tcPr>
+            <w:tcW w:type="dxa" w:w="4586"/>
+          </w:tcPr>
+          <w:p>
+            <w:r/>
+            <w:r>
+              <w:t>partyRoleDeleteEvent</w:t>
+            </w:r>
+            <w:r>
+              <w:br/>
+            </w:r>
+            <w:r>
+              <w:t>partyRoleSpecificationDeleteEvent</w:t>
             </w:r>
           </w:p>
         </w:tc>
@@ -9865,34 +10035,32 @@
       <w:tr>
         <w:tc>
           <w:tcPr>
-            <w:tcW w:type="dxa" w:w="1217"/>
-          </w:tcPr>
-          <w:p>
-            <w:r/>
-            <w:r>
-              <w:t>TMF651</w:t>
-            </w:r>
-          </w:p>
-        </w:tc>
-        <w:tc>
-          <w:tcPr>
-            <w:tcW w:type="dxa" w:w="4025"/>
-          </w:tcPr>
-          <w:p>
-            <w:r/>
-            <w:r>
-              <w:t>Agreement Management API</w:t>
-            </w:r>
-          </w:p>
-        </w:tc>
-        <w:tc>
-          <w:tcPr>
-            <w:tcW w:type="dxa" w:w="4118"/>
-          </w:tcPr>
-          <w:p>
-            <w:r/>
-            <w:r>
-              <w:t>agreementDeleteEvent</w:t>
+            <w:tcW w:type="dxa" w:w="1310"/>
+          </w:tcPr>
+          <w:p>
+            <w:r/>
+            <w:r/>
+          </w:p>
+        </w:tc>
+        <w:tc>
+          <w:tcPr>
+            <w:tcW w:type="dxa" w:w="3463"/>
+          </w:tcPr>
+          <w:p>
+            <w:r/>
+            <w:r>
+              <w:t>PaymentManagement</w:t>
+            </w:r>
+          </w:p>
+        </w:tc>
+        <w:tc>
+          <w:tcPr>
+            <w:tcW w:type="dxa" w:w="4586"/>
+          </w:tcPr>
+          <w:p>
+            <w:r/>
+            <w:r>
+              <w:t>paymentDeleteEvent</w:t>
             </w:r>
           </w:p>
         </w:tc>
@@ -9900,58 +10068,32 @@
       <w:tr>
         <w:tc>
           <w:tcPr>
-            <w:tcW w:type="dxa" w:w="1217"/>
-          </w:tcPr>
-          <w:p>
-            <w:r/>
-            <w:r>
-              <w:t>TMF652</w:t>
-            </w:r>
-          </w:p>
-        </w:tc>
-        <w:tc>
-          <w:tcPr>
-            <w:tcW w:type="dxa" w:w="4025"/>
-          </w:tcPr>
-          <w:p>
-            <w:r/>
-            <w:r>
-              <w:t>Resource Order Management API</w:t>
-            </w:r>
-          </w:p>
-        </w:tc>
-        <w:tc>
-          <w:tcPr>
-            <w:tcW w:type="dxa" w:w="4118"/>
-          </w:tcPr>
-          <w:p>
-            <w:r/>
-            <w:r>
-              <w:t>cancelResourceOrderInformationRequiredEvent</w:t>
-            </w:r>
-            <w:r>
-              <w:br/>
-            </w:r>
-            <w:r>
-              <w:t>cancelResourceOrderStateChange</w:t>
-            </w:r>
-            <w:r>
-              <w:br/>
-            </w:r>
-            <w:r>
-              <w:t>resourceOrderAttributeValueChangeEvent</w:t>
-            </w:r>
-            <w:r>
-              <w:br/>
-            </w:r>
-            <w:r>
-              <w:t>resourceOrderInformationRequiredEvent</w:t>
-            </w:r>
-            <w:r>
-              <w:br/>
-            </w:r>
-            <w:r>
-              <w:t>resourceOrderStateChange</w:t>
+            <w:tcW w:type="dxa" w:w="1310"/>
+          </w:tcPr>
+          <w:p>
+            <w:r/>
+            <w:r/>
+          </w:p>
+        </w:tc>
+        <w:tc>
+          <w:tcPr>
+            <w:tcW w:type="dxa" w:w="3463"/>
+          </w:tcPr>
+          <w:p>
+            <w:r/>
+            <w:r>
+              <w:t>AccountManagement</w:t>
+            </w:r>
+          </w:p>
+        </w:tc>
+        <w:tc>
+          <w:tcPr>
+            <w:tcW w:type="dxa" w:w="4586"/>
+          </w:tcPr>
+          <w:p>
+            <w:r/>
+            <w:r>
+              <w:t>billingAccountDeleteEvent</w:t>
             </w:r>
           </w:p>
         </w:tc>
@@ -9959,34 +10101,32 @@
       <w:tr>
         <w:tc>
           <w:tcPr>
-            <w:tcW w:type="dxa" w:w="1217"/>
-          </w:tcPr>
-          <w:p>
-            <w:r/>
-            <w:r>
-              <w:t>TMF666</w:t>
-            </w:r>
-          </w:p>
-        </w:tc>
-        <w:tc>
-          <w:tcPr>
-            <w:tcW w:type="dxa" w:w="4025"/>
-          </w:tcPr>
-          <w:p>
-            <w:r/>
-            <w:r>
-              <w:t>Account Management API</w:t>
-            </w:r>
-          </w:p>
-        </w:tc>
-        <w:tc>
-          <w:tcPr>
-            <w:tcW w:type="dxa" w:w="4118"/>
-          </w:tcPr>
-          <w:p>
-            <w:r/>
-            <w:r>
-              <w:t>billingAccountDeleteEvent</w:t>
+            <w:tcW w:type="dxa" w:w="1310"/>
+          </w:tcPr>
+          <w:p>
+            <w:r/>
+            <w:r/>
+          </w:p>
+        </w:tc>
+        <w:tc>
+          <w:tcPr>
+            <w:tcW w:type="dxa" w:w="3463"/>
+          </w:tcPr>
+          <w:p>
+            <w:r/>
+            <w:r>
+              <w:t>AgreementManagement</w:t>
+            </w:r>
+          </w:p>
+        </w:tc>
+        <w:tc>
+          <w:tcPr>
+            <w:tcW w:type="dxa" w:w="4586"/>
+          </w:tcPr>
+          <w:p>
+            <w:r/>
+            <w:r>
+              <w:t>agreementDeleteEvent</w:t>
             </w:r>
           </w:p>
         </w:tc>
@@ -9994,40 +10134,32 @@
       <w:tr>
         <w:tc>
           <w:tcPr>
-            <w:tcW w:type="dxa" w:w="1217"/>
-          </w:tcPr>
-          <w:p>
-            <w:r/>
-            <w:r>
-              <w:t>TMF669</w:t>
-            </w:r>
-          </w:p>
-        </w:tc>
-        <w:tc>
-          <w:tcPr>
-            <w:tcW w:type="dxa" w:w="4025"/>
-          </w:tcPr>
-          <w:p>
-            <w:r/>
-            <w:r>
-              <w:t>Party Role Management API</w:t>
-            </w:r>
-          </w:p>
-        </w:tc>
-        <w:tc>
-          <w:tcPr>
-            <w:tcW w:type="dxa" w:w="4118"/>
-          </w:tcPr>
-          <w:p>
-            <w:r/>
-            <w:r>
-              <w:t>partyRoleDeleteEvent</w:t>
-            </w:r>
-            <w:r>
-              <w:br/>
-            </w:r>
-            <w:r>
-              <w:t>partyRoleSpecificationDeleteEvent</w:t>
+            <w:tcW w:type="dxa" w:w="1310"/>
+          </w:tcPr>
+          <w:p>
+            <w:r/>
+            <w:r/>
+          </w:p>
+        </w:tc>
+        <w:tc>
+          <w:tcPr>
+            <w:tcW w:type="dxa" w:w="3463"/>
+          </w:tcPr>
+          <w:p>
+            <w:r/>
+            <w:r>
+              <w:t>ResourceInventoryManagement</w:t>
+            </w:r>
+          </w:p>
+        </w:tc>
+        <w:tc>
+          <w:tcPr>
+            <w:tcW w:type="dxa" w:w="4586"/>
+          </w:tcPr>
+          <w:p>
+            <w:r/>
+            <w:r>
+              <w:t>resourceDeleteEvent</w:t>
             </w:r>
           </w:p>
         </w:tc>
@@ -10035,52 +10167,32 @@
       <w:tr>
         <w:tc>
           <w:tcPr>
-            <w:tcW w:type="dxa" w:w="1217"/>
-          </w:tcPr>
-          <w:p>
-            <w:r/>
-            <w:r>
-              <w:t>TMF673</w:t>
-            </w:r>
-          </w:p>
-        </w:tc>
-        <w:tc>
-          <w:tcPr>
-            <w:tcW w:type="dxa" w:w="4025"/>
-          </w:tcPr>
-          <w:p>
-            <w:r/>
-            <w:r>
-              <w:t>Geographic Address Management API</w:t>
-            </w:r>
-          </w:p>
-        </w:tc>
-        <w:tc>
-          <w:tcPr>
-            <w:tcW w:type="dxa" w:w="4118"/>
-          </w:tcPr>
-          <w:p>
-            <w:r/>
-            <w:r>
-              <w:t>geographicAddressAttributeValueChangeEvent</w:t>
-            </w:r>
-            <w:r>
-              <w:br/>
-            </w:r>
-            <w:r>
-              <w:t>geographicAddressCreateEvent</w:t>
-            </w:r>
-            <w:r>
-              <w:br/>
-            </w:r>
-            <w:r>
-              <w:t>geographicAddressDeleteEvent</w:t>
-            </w:r>
-            <w:r>
-              <w:br/>
-            </w:r>
-            <w:r>
-              <w:t>geographicAddressValidationStateChangeEvent</w:t>
+            <w:tcW w:type="dxa" w:w="1310"/>
+          </w:tcPr>
+          <w:p>
+            <w:r/>
+            <w:r/>
+          </w:p>
+        </w:tc>
+        <w:tc>
+          <w:tcPr>
+            <w:tcW w:type="dxa" w:w="3463"/>
+          </w:tcPr>
+          <w:p>
+            <w:r/>
+            <w:r>
+              <w:t>ResourceCatalogManagement</w:t>
+            </w:r>
+          </w:p>
+        </w:tc>
+        <w:tc>
+          <w:tcPr>
+            <w:tcW w:type="dxa" w:w="4586"/>
+          </w:tcPr>
+          <w:p>
+            <w:r/>
+            <w:r>
+              <w:t>resourceSpecificationDeleteEvent</w:t>
             </w:r>
           </w:p>
         </w:tc>
@@ -10088,58 +10200,32 @@
       <w:tr>
         <w:tc>
           <w:tcPr>
-            <w:tcW w:type="dxa" w:w="1217"/>
-          </w:tcPr>
-          <w:p>
-            <w:r/>
-            <w:r>
-              <w:t>TMF674</w:t>
-            </w:r>
-          </w:p>
-        </w:tc>
-        <w:tc>
-          <w:tcPr>
-            <w:tcW w:type="dxa" w:w="4025"/>
-          </w:tcPr>
-          <w:p>
-            <w:r/>
-            <w:r>
-              <w:t>Geographic Site Management API</w:t>
-            </w:r>
-          </w:p>
-        </w:tc>
-        <w:tc>
-          <w:tcPr>
-            <w:tcW w:type="dxa" w:w="4118"/>
-          </w:tcPr>
-          <w:p>
-            <w:r/>
-            <w:r>
-              <w:t>geographicSiteAttributeValueChangeEvent</w:t>
-            </w:r>
-            <w:r>
-              <w:br/>
-            </w:r>
-            <w:r>
-              <w:t>geographicSiteCreateEvent</w:t>
-            </w:r>
-            <w:r>
-              <w:br/>
-            </w:r>
-            <w:r>
-              <w:t>geographicSiteDeleteEvent</w:t>
-            </w:r>
-            <w:r>
-              <w:br/>
-            </w:r>
-            <w:r>
-              <w:t>geographicSiteStateChangeEvent</w:t>
-            </w:r>
-            <w:r>
-              <w:br/>
-            </w:r>
-            <w:r>
-              <w:t>geographicSiteStatusChangeEvent</w:t>
+            <w:tcW w:type="dxa" w:w="1310"/>
+          </w:tcPr>
+          <w:p>
+            <w:r/>
+            <w:r/>
+          </w:p>
+        </w:tc>
+        <w:tc>
+          <w:tcPr>
+            <w:tcW w:type="dxa" w:w="3463"/>
+          </w:tcPr>
+          <w:p>
+            <w:r/>
+            <w:r>
+              <w:t>ServiceInventoryManagement</w:t>
+            </w:r>
+          </w:p>
+        </w:tc>
+        <w:tc>
+          <w:tcPr>
+            <w:tcW w:type="dxa" w:w="4586"/>
+          </w:tcPr>
+          <w:p>
+            <w:r/>
+            <w:r>
+              <w:t>serviceDeleteEvent</w:t>
             </w:r>
           </w:p>
         </w:tc>
@@ -10147,46 +10233,32 @@
       <w:tr>
         <w:tc>
           <w:tcPr>
-            <w:tcW w:type="dxa" w:w="1217"/>
-          </w:tcPr>
-          <w:p>
-            <w:r/>
-            <w:r>
-              <w:t>TMF675</w:t>
-            </w:r>
-          </w:p>
-        </w:tc>
-        <w:tc>
-          <w:tcPr>
-            <w:tcW w:type="dxa" w:w="4025"/>
-          </w:tcPr>
-          <w:p>
-            <w:r/>
-            <w:r>
-              <w:t>Geographic Location Management API</w:t>
-            </w:r>
-          </w:p>
-        </w:tc>
-        <w:tc>
-          <w:tcPr>
-            <w:tcW w:type="dxa" w:w="4118"/>
-          </w:tcPr>
-          <w:p>
-            <w:r/>
-            <w:r>
-              <w:t>geographicLocationAttributeValueChangeEvent</w:t>
-            </w:r>
-            <w:r>
-              <w:br/>
-            </w:r>
-            <w:r>
-              <w:t>geographicLocationCreateEvent</w:t>
-            </w:r>
-            <w:r>
-              <w:br/>
-            </w:r>
-            <w:r>
-              <w:t>geographicLocationDeleteEvent</w:t>
+            <w:tcW w:type="dxa" w:w="1310"/>
+          </w:tcPr>
+          <w:p>
+            <w:r/>
+            <w:r/>
+          </w:p>
+        </w:tc>
+        <w:tc>
+          <w:tcPr>
+            <w:tcW w:type="dxa" w:w="3463"/>
+          </w:tcPr>
+          <w:p>
+            <w:r/>
+            <w:r>
+              <w:t>ServiceCatalogManagement</w:t>
+            </w:r>
+          </w:p>
+        </w:tc>
+        <w:tc>
+          <w:tcPr>
+            <w:tcW w:type="dxa" w:w="4586"/>
+          </w:tcPr>
+          <w:p>
+            <w:r/>
+            <w:r>
+              <w:t>serviceSpecificationDeleteEvent</w:t>
             </w:r>
           </w:p>
         </w:tc>
@@ -10194,34 +10266,56 @@
       <w:tr>
         <w:tc>
           <w:tcPr>
-            <w:tcW w:type="dxa" w:w="1217"/>
-          </w:tcPr>
-          <w:p>
-            <w:r/>
-            <w:r>
-              <w:t>TMF676</w:t>
-            </w:r>
-          </w:p>
-        </w:tc>
-        <w:tc>
-          <w:tcPr>
-            <w:tcW w:type="dxa" w:w="4025"/>
-          </w:tcPr>
-          <w:p>
-            <w:r/>
-            <w:r>
-              <w:t>Payment Management API</w:t>
-            </w:r>
-          </w:p>
-        </w:tc>
-        <w:tc>
-          <w:tcPr>
-            <w:tcW w:type="dxa" w:w="4118"/>
-          </w:tcPr>
-          <w:p>
-            <w:r/>
-            <w:r>
-              <w:t>paymentDeleteEvent</w:t>
+            <w:tcW w:type="dxa" w:w="1310"/>
+          </w:tcPr>
+          <w:p>
+            <w:r/>
+            <w:r/>
+          </w:p>
+        </w:tc>
+        <w:tc>
+          <w:tcPr>
+            <w:tcW w:type="dxa" w:w="3463"/>
+          </w:tcPr>
+          <w:p>
+            <w:r/>
+            <w:r>
+              <w:t>ProductInventoryManagement</w:t>
+            </w:r>
+          </w:p>
+        </w:tc>
+        <w:tc>
+          <w:tcPr>
+            <w:tcW w:type="dxa" w:w="4586"/>
+          </w:tcPr>
+          <w:p>
+            <w:r/>
+            <w:r>
+              <w:t>productCreateEvent</w:t>
+            </w:r>
+            <w:r>
+              <w:br/>
+            </w:r>
+            <w:r>
+              <w:t>productAttributeValueChangeEvent</w:t>
+            </w:r>
+            <w:r>
+              <w:br/>
+            </w:r>
+            <w:r>
+              <w:t>productStateChangeEvent</w:t>
+            </w:r>
+            <w:r>
+              <w:br/>
+            </w:r>
+            <w:r>
+              <w:t>productDeleteEvent</w:t>
+            </w:r>
+            <w:r>
+              <w:br/>
+            </w:r>
+            <w:r>
+              <w:t>productBatchEvent</w:t>
             </w:r>
           </w:p>
         </w:tc>
@@ -10229,82 +10323,44 @@
       <w:tr>
         <w:tc>
           <w:tcPr>
-            <w:tcW w:type="dxa" w:w="1217"/>
-          </w:tcPr>
-          <w:p>
-            <w:r/>
-            <w:r>
-              <w:t>TMF679</w:t>
-            </w:r>
-          </w:p>
-        </w:tc>
-        <w:tc>
-          <w:tcPr>
-            <w:tcW w:type="dxa" w:w="4025"/>
-          </w:tcPr>
-          <w:p>
-            <w:r/>
-            <w:r>
-              <w:t>Product Offering Qualification Management API</w:t>
-            </w:r>
-          </w:p>
-        </w:tc>
-        <w:tc>
-          <w:tcPr>
-            <w:tcW w:type="dxa" w:w="4118"/>
-          </w:tcPr>
-          <w:p>
-            <w:r/>
-            <w:r>
-              <w:t>checkProductOfferingQualificationAttributeValueChangeEvent</w:t>
-            </w:r>
-            <w:r>
-              <w:br/>
-            </w:r>
-            <w:r>
-              <w:t>checkProductOfferingQualificationCreateEvent</w:t>
-            </w:r>
-            <w:r>
-              <w:br/>
-            </w:r>
-            <w:r>
-              <w:t>checkProductOfferingQualificationDeleteEvent</w:t>
-            </w:r>
-            <w:r>
-              <w:br/>
-            </w:r>
-            <w:r>
-              <w:t>checkProductOfferingQualificationStateChangeEvent</w:t>
-            </w:r>
-            <w:r>
-              <w:br/>
-            </w:r>
-            <w:r>
-              <w:t>productOfferingQualificationAttributeValueChangeEvent</w:t>
-            </w:r>
-            <w:r>
-              <w:br/>
-            </w:r>
-            <w:r>
-              <w:t>productOfferingQualificationCreateEvent</w:t>
-            </w:r>
-            <w:r>
-              <w:br/>
-            </w:r>
-            <w:r>
-              <w:t>productOfferingQualificationDeleteEvent</w:t>
-            </w:r>
-            <w:r>
-              <w:br/>
-            </w:r>
-            <w:r>
-              <w:t>productOfferingQualificationInformationRequiredEvent</w:t>
-            </w:r>
-            <w:r>
-              <w:br/>
-            </w:r>
-            <w:r>
-              <w:t>productOfferingQualificationStateChangeEvent</w:t>
+            <w:tcW w:type="dxa" w:w="1310"/>
+          </w:tcPr>
+          <w:p>
+            <w:r/>
+            <w:r/>
+          </w:p>
+        </w:tc>
+        <w:tc>
+          <w:tcPr>
+            <w:tcW w:type="dxa" w:w="3463"/>
+          </w:tcPr>
+          <w:p>
+            <w:r/>
+            <w:r>
+              <w:t>ProductCatalogManagement</w:t>
+            </w:r>
+          </w:p>
+        </w:tc>
+        <w:tc>
+          <w:tcPr>
+            <w:tcW w:type="dxa" w:w="4586"/>
+          </w:tcPr>
+          <w:p>
+            <w:r/>
+            <w:r>
+              <w:t>productSpecificationDeleteEvent</w:t>
+            </w:r>
+            <w:r>
+              <w:br/>
+            </w:r>
+            <w:r>
+              <w:t>productOfferingDeleteEvent</w:t>
+            </w:r>
+            <w:r>
+              <w:br/>
+            </w:r>
+            <w:r>
+              <w:t>productOfferingPriceDeleteEvent</w:t>
             </w:r>
           </w:p>
         </w:tc>
@@ -10312,52 +10368,32 @@
       <w:tr>
         <w:tc>
           <w:tcPr>
-            <w:tcW w:type="dxa" w:w="1217"/>
-          </w:tcPr>
-          <w:p>
-            <w:r/>
-            <w:r>
-              <w:t>TMF921</w:t>
-            </w:r>
-          </w:p>
-        </w:tc>
-        <w:tc>
-          <w:tcPr>
-            <w:tcW w:type="dxa" w:w="4025"/>
-          </w:tcPr>
-          <w:p>
-            <w:r/>
-            <w:r>
-              <w:t>Intent Management API</w:t>
-            </w:r>
-          </w:p>
-        </w:tc>
-        <w:tc>
-          <w:tcPr>
-            <w:tcW w:type="dxa" w:w="4118"/>
-          </w:tcPr>
-          <w:p>
-            <w:r/>
-            <w:r>
-              <w:t>intentAttributeValueChangeEvent</w:t>
-            </w:r>
-            <w:r>
-              <w:br/>
-            </w:r>
-            <w:r>
-              <w:t>intentCreateEvent</w:t>
-            </w:r>
-            <w:r>
-              <w:br/>
-            </w:r>
-            <w:r>
-              <w:t>intentDeleteEvent</w:t>
-            </w:r>
-            <w:r>
-              <w:br/>
-            </w:r>
-            <w:r>
-              <w:t>intentStatusChangeEvent</w:t>
+            <w:tcW w:type="dxa" w:w="1310"/>
+          </w:tcPr>
+          <w:p>
+            <w:r/>
+            <w:r/>
+          </w:p>
+        </w:tc>
+        <w:tc>
+          <w:tcPr>
+            <w:tcW w:type="dxa" w:w="3463"/>
+          </w:tcPr>
+          <w:p>
+            <w:r/>
+            <w:r>
+              <w:t>QuoteManagement</w:t>
+            </w:r>
+          </w:p>
+        </w:tc>
+        <w:tc>
+          <w:tcPr>
+            <w:tcW w:type="dxa" w:w="4586"/>
+          </w:tcPr>
+          <w:p>
+            <w:r/>
+            <w:r>
+              <w:t>quoteDeleteEvent</w:t>
             </w:r>
           </w:p>
         </w:tc>
@@ -10368,8 +10404,8 @@
       <w:r>
         <w:drawing>
           <wp:inline xmlns:a="http://schemas.openxmlformats.org/drawingml/2006/main" xmlns:pic="http://schemas.openxmlformats.org/drawingml/2006/picture">
-            <wp:extent cx="5394960" cy="8036289"/>
-            <wp:docPr id="7" name="Picture 7"/>
+            <wp:extent cx="5394960" cy="7603997"/>
+            <wp:docPr id="8" name="Picture 8"/>
             <wp:cNvGraphicFramePr>
               <a:graphicFrameLocks noChangeAspect="1"/>
             </wp:cNvGraphicFramePr>
@@ -10377,11 +10413,11 @@
               <a:graphicData uri="http://schemas.openxmlformats.org/drawingml/2006/picture">
                 <pic:pic>
                   <pic:nvPicPr>
-                    <pic:cNvPr id="0" name="TMFC003_Subscribed_Events.png"/>
+                    <pic:cNvPr id="0" name="TMFC003_Subscribed_Events_1.png"/>
                     <pic:cNvPicPr/>
                   </pic:nvPicPr>
                   <pic:blipFill>
-                    <a:blip r:embed="rId53"/>
+                    <a:blip r:embed="rId54"/>
                     <a:stretch>
                       <a:fillRect/>
                     </a:stretch>
@@ -10389,7 +10425,43 @@
                   <pic:spPr>
                     <a:xfrm>
                       <a:off x="0" y="0"/>
-                      <a:ext cx="5394960" cy="8036289"/>
+                      <a:ext cx="5394960" cy="7603997"/>
+                    </a:xfrm>
+                    <a:prstGeom prst="rect"/>
+                  </pic:spPr>
+                </pic:pic>
+              </a:graphicData>
+            </a:graphic>
+          </wp:inline>
+        </w:drawing>
+      </w:r>
+    </w:p>
+    <w:p>
+      <w:r>
+        <w:drawing>
+          <wp:inline xmlns:a="http://schemas.openxmlformats.org/drawingml/2006/main" xmlns:pic="http://schemas.openxmlformats.org/drawingml/2006/picture">
+            <wp:extent cx="5394960" cy="747570"/>
+            <wp:docPr id="9" name="Picture 9"/>
+            <wp:cNvGraphicFramePr>
+              <a:graphicFrameLocks noChangeAspect="1"/>
+            </wp:cNvGraphicFramePr>
+            <a:graphic>
+              <a:graphicData uri="http://schemas.openxmlformats.org/drawingml/2006/picture">
+                <pic:pic>
+                  <pic:nvPicPr>
+                    <pic:cNvPr id="0" name="TMFC003_Subscribed_Events_2.png"/>
+                    <pic:cNvPicPr/>
+                  </pic:nvPicPr>
+                  <pic:blipFill>
+                    <a:blip r:embed="rId55"/>
+                    <a:stretch>
+                      <a:fillRect/>
+                    </a:stretch>
+                  </pic:blipFill>
+                  <pic:spPr>
+                    <a:xfrm>
+                      <a:off x="0" y="0"/>
+                      <a:ext cx="5394960" cy="747570"/>
                     </a:xfrm>
                     <a:prstGeom prst="rect"/>
                   </pic:spPr>

</xml_diff>

<commit_message>
Fix missing split-diagram captions and image labels in docx export
build_docx_scroll.py was dropping the "(1 of 3)"-style image caption
entirely (never read from the parsed block at all) and, for the first
page of a split diagram, the "split across N diagrams..." notice along
with the source-file caption it was bundled with. Net effect: split
Dependent API / Subscribed Events diagrams appeared as unlabeled images
running into each other with no indication of the split.

Now every diagram gets its alt-text caption rendered below it, and the
split-notice sentence survives independently of the source-link caption
it's dropped alongside.

Co-Authored-By: Claude Sonnet 5 <noreply@anthropic.com>
</commit_message>
<xml_diff>
--- a/specifications/TMFC003-ProductOrderDeliveryOrchestrationAndManagement/Diagrams/TMFC003_Product_Order_Delivery_Orchestration_and_Management.docx
+++ b/specifications/TMFC003-ProductOrderDeliveryOrchestrationAndManagement/Diagrams/TMFC003_Product_Order_Delivery_Orchestration_and_Management.docx
@@ -868,6 +868,14 @@
       </w:r>
     </w:p>
     <w:p>
+      <w:r>
+        <w:rPr>
+          <w:i/>
+        </w:rPr>
+        <w:t>eTOM L2 - SID ABEs links diagram</w:t>
+      </w:r>
+    </w:p>
+    <w:p>
       <w:pPr>
         <w:pStyle w:val="Heading2"/>
       </w:pPr>
@@ -3383,6 +3391,14 @@
       </w:r>
     </w:p>
     <w:p>
+      <w:r>
+        <w:rPr>
+          <w:i/>
+        </w:rPr>
+        <w:t>API Context diagram</w:t>
+      </w:r>
+    </w:p>
+    <w:p>
       <w:pPr>
         <w:pStyle w:val="Heading2"/>
       </w:pPr>
@@ -4398,6 +4414,14 @@
             </a:graphic>
           </wp:inline>
         </w:drawing>
+      </w:r>
+    </w:p>
+    <w:p>
+      <w:r>
+        <w:rPr>
+          <w:i/>
+        </w:rPr>
+        <w:t>Exposed API diagram</w:t>
       </w:r>
     </w:p>
     <w:p>
@@ -8930,6 +8954,22 @@
     </w:p>
     <w:p>
       <w:r>
+        <w:rPr>
+          <w:i/>
+        </w:rPr>
+        <w:t>Dependent API diagram (1 of 3)</w:t>
+      </w:r>
+    </w:p>
+    <w:p>
+      <w:r>
+        <w:rPr>
+          <w:i/>
+        </w:rPr>
+        <w:t>split across 3 diagrams since the full dependent-API list has more than 60 operations combined; see the following two diagrams for the rest.</w:t>
+      </w:r>
+    </w:p>
+    <w:p>
+      <w:r>
         <w:drawing>
           <wp:inline xmlns:a="http://schemas.openxmlformats.org/drawingml/2006/main" xmlns:pic="http://schemas.openxmlformats.org/drawingml/2006/picture">
             <wp:extent cx="5394960" cy="5776458"/>
@@ -8962,6 +9002,14 @@
             </a:graphic>
           </wp:inline>
         </w:drawing>
+      </w:r>
+    </w:p>
+    <w:p>
+      <w:r>
+        <w:rPr>
+          <w:i/>
+        </w:rPr>
+        <w:t>Dependent API diagram (2 of 3)</w:t>
       </w:r>
     </w:p>
     <w:p>
@@ -9001,6 +9049,14 @@
       </w:r>
     </w:p>
     <w:p>
+      <w:r>
+        <w:rPr>
+          <w:i/>
+        </w:rPr>
+        <w:t>Dependent API diagram (3 of 3)</w:t>
+      </w:r>
+    </w:p>
+    <w:p>
       <w:pPr>
         <w:pStyle w:val="Heading2"/>
       </w:pPr>
@@ -9409,6 +9465,14 @@
             </a:graphic>
           </wp:inline>
         </w:drawing>
+      </w:r>
+    </w:p>
+    <w:p>
+      <w:r>
+        <w:rPr>
+          <w:i/>
+        </w:rPr>
+        <w:t>Published Events diagram</w:t>
       </w:r>
     </w:p>
     <w:p>
@@ -10438,6 +10502,22 @@
     </w:p>
     <w:p>
       <w:r>
+        <w:rPr>
+          <w:i/>
+        </w:rPr>
+        <w:t>Subscribed Events diagram (1 of 2)</w:t>
+      </w:r>
+    </w:p>
+    <w:p>
+      <w:r>
+        <w:rPr>
+          <w:i/>
+        </w:rPr>
+        <w:t>split across 2 diagrams since the full subscribed-events list has more than 60 event names combined; see the following diagram for the rest.</w:t>
+      </w:r>
+    </w:p>
+    <w:p>
+      <w:r>
         <w:drawing>
           <wp:inline xmlns:a="http://schemas.openxmlformats.org/drawingml/2006/main" xmlns:pic="http://schemas.openxmlformats.org/drawingml/2006/picture">
             <wp:extent cx="5394960" cy="747570"/>
@@ -10470,6 +10550,14 @@
             </a:graphic>
           </wp:inline>
         </w:drawing>
+      </w:r>
+    </w:p>
+    <w:p>
+      <w:r>
+        <w:rPr>
+          <w:i/>
+        </w:rPr>
+        <w:t>Subscribed Events diagram (2 of 2)</w:t>
       </w:r>
     </w:p>
     <w:p>

</xml_diff>

<commit_message>
Fix missing split-diagram captions and image labels in docx export (#22)
build_docx_scroll.py was dropping the "(1 of 3)"-style image caption
entirely (never read from the parsed block at all) and, for the first
page of a split diagram, the "split across N diagrams..." notice along
with the source-file caption it was bundled with. Net effect: split
Dependent API / Subscribed Events diagrams appeared as unlabeled images
running into each other with no indication of the split.

Now every diagram gets its alt-text caption rendered below it, and the
split-notice sentence survives independently of the source-link caption
it's dropped alongside.

Co-authored-by: Claude Sonnet 5 <noreply@anthropic.com>
</commit_message>
<xml_diff>
--- a/specifications/TMFC003-ProductOrderDeliveryOrchestrationAndManagement/Diagrams/TMFC003_Product_Order_Delivery_Orchestration_and_Management.docx
+++ b/specifications/TMFC003-ProductOrderDeliveryOrchestrationAndManagement/Diagrams/TMFC003_Product_Order_Delivery_Orchestration_and_Management.docx
@@ -868,6 +868,14 @@
       </w:r>
     </w:p>
     <w:p>
+      <w:r>
+        <w:rPr>
+          <w:i/>
+        </w:rPr>
+        <w:t>eTOM L2 - SID ABEs links diagram</w:t>
+      </w:r>
+    </w:p>
+    <w:p>
       <w:pPr>
         <w:pStyle w:val="Heading2"/>
       </w:pPr>
@@ -3383,6 +3391,14 @@
       </w:r>
     </w:p>
     <w:p>
+      <w:r>
+        <w:rPr>
+          <w:i/>
+        </w:rPr>
+        <w:t>API Context diagram</w:t>
+      </w:r>
+    </w:p>
+    <w:p>
       <w:pPr>
         <w:pStyle w:val="Heading2"/>
       </w:pPr>
@@ -4398,6 +4414,14 @@
             </a:graphic>
           </wp:inline>
         </w:drawing>
+      </w:r>
+    </w:p>
+    <w:p>
+      <w:r>
+        <w:rPr>
+          <w:i/>
+        </w:rPr>
+        <w:t>Exposed API diagram</w:t>
       </w:r>
     </w:p>
     <w:p>
@@ -8930,6 +8954,22 @@
     </w:p>
     <w:p>
       <w:r>
+        <w:rPr>
+          <w:i/>
+        </w:rPr>
+        <w:t>Dependent API diagram (1 of 3)</w:t>
+      </w:r>
+    </w:p>
+    <w:p>
+      <w:r>
+        <w:rPr>
+          <w:i/>
+        </w:rPr>
+        <w:t>split across 3 diagrams since the full dependent-API list has more than 60 operations combined; see the following two diagrams for the rest.</w:t>
+      </w:r>
+    </w:p>
+    <w:p>
+      <w:r>
         <w:drawing>
           <wp:inline xmlns:a="http://schemas.openxmlformats.org/drawingml/2006/main" xmlns:pic="http://schemas.openxmlformats.org/drawingml/2006/picture">
             <wp:extent cx="5394960" cy="5776458"/>
@@ -8962,6 +9002,14 @@
             </a:graphic>
           </wp:inline>
         </w:drawing>
+      </w:r>
+    </w:p>
+    <w:p>
+      <w:r>
+        <w:rPr>
+          <w:i/>
+        </w:rPr>
+        <w:t>Dependent API diagram (2 of 3)</w:t>
       </w:r>
     </w:p>
     <w:p>
@@ -9001,6 +9049,14 @@
       </w:r>
     </w:p>
     <w:p>
+      <w:r>
+        <w:rPr>
+          <w:i/>
+        </w:rPr>
+        <w:t>Dependent API diagram (3 of 3)</w:t>
+      </w:r>
+    </w:p>
+    <w:p>
       <w:pPr>
         <w:pStyle w:val="Heading2"/>
       </w:pPr>
@@ -9409,6 +9465,14 @@
             </a:graphic>
           </wp:inline>
         </w:drawing>
+      </w:r>
+    </w:p>
+    <w:p>
+      <w:r>
+        <w:rPr>
+          <w:i/>
+        </w:rPr>
+        <w:t>Published Events diagram</w:t>
       </w:r>
     </w:p>
     <w:p>
@@ -10438,6 +10502,22 @@
     </w:p>
     <w:p>
       <w:r>
+        <w:rPr>
+          <w:i/>
+        </w:rPr>
+        <w:t>Subscribed Events diagram (1 of 2)</w:t>
+      </w:r>
+    </w:p>
+    <w:p>
+      <w:r>
+        <w:rPr>
+          <w:i/>
+        </w:rPr>
+        <w:t>split across 2 diagrams since the full subscribed-events list has more than 60 event names combined; see the following diagram for the rest.</w:t>
+      </w:r>
+    </w:p>
+    <w:p>
+      <w:r>
         <w:drawing>
           <wp:inline xmlns:a="http://schemas.openxmlformats.org/drawingml/2006/main" xmlns:pic="http://schemas.openxmlformats.org/drawingml/2006/picture">
             <wp:extent cx="5394960" cy="747570"/>
@@ -10470,6 +10550,14 @@
             </a:graphic>
           </wp:inline>
         </w:drawing>
+      </w:r>
+    </w:p>
+    <w:p>
+      <w:r>
+        <w:rPr>
+          <w:i/>
+        </w:rPr>
+        <w:t>Subscribed Events diagram (2 of 2)</w:t>
       </w:r>
     </w:p>
     <w:p>

</xml_diff>